<commit_message>
Fix the empty @tbl-area-recipe: a bare relative path never resolved
The chunk read "results/tables/corrected/area_recipe_within.csv" with a bare
relative path, but Quarto renders with the working directory at docs/, so it
resolved to docs/results/... which does not exist. file.exists() was therefore
always FALSE, the chunk emitted nothing, and the table rendered empty behind a
live @tbl-area-recipe cross-reference in the text. The only symptom was a
"FloatRefTarget with no content" line in the render log.

Every other chunk in the file already used here::here(); this one did not. Now
it does, and the else branch stops the render instead of silently producing a
manuscript with a referenced but absent table.

Checked: no other bare relative paths remain in the file.

Co-Authored-By: Claude Opus 5 <noreply@anthropic.com>
</commit_message>
<xml_diff>
--- a/docs/manuscript_mcn.docx
+++ b/docs/manuscript_mcn.docx
@@ -4180,7 +4180,7 @@
     </w:p>
     <w:bookmarkEnd w:id="26"/>
     <w:bookmarkEnd w:id="27"/>
-    <w:bookmarkStart w:id="62" w:name="results"/>
+    <w:bookmarkStart w:id="63" w:name="results"/>
     <w:p>
       <w:pPr>
         <w:pStyle w:val="Heading1"/>
@@ -31441,7 +31441,7 @@
       </w:r>
     </w:p>
     <w:bookmarkEnd w:id="31"/>
-    <w:bookmarkStart w:id="32" w:name="sec-recipe-audit"/>
+    <w:bookmarkStart w:id="33" w:name="sec-recipe-audit"/>
     <w:p>
       <w:pPr>
         <w:pStyle w:val="Heading2"/>
@@ -31757,230 +31757,6 @@
       </w:r>
       <w:r>
         <w:t xml:space="preserve">for iron and folate in Malawi, and was absent for zinc.</w:t>
-      </w:r>
-    </w:p>
-    <w:bookmarkEnd w:id="32"/>
-    <w:bookmarkStart w:id="43" w:name="cross-country-transportability"/>
-    <w:p>
-      <w:pPr>
-        <w:pStyle w:val="Heading2"/>
-      </w:pPr>
-      <w:r>
-        <w:t xml:space="preserve">3.5 Cross-country transportability</w:t>
-      </w:r>
-    </w:p>
-    <w:p>
-      <w:pPr>
-        <w:pStyle w:val="FirstParagraph"/>
-      </w:pPr>
-      <w:r>
-        <w:t xml:space="preserve">LOCO holdout produced markedly weaker performance than within-country</w:t>
-      </w:r>
-      <w:r>
-        <w:t xml:space="preserve"> </w:t>
-      </w:r>
-      <w:r>
-        <w:t xml:space="preserve">cross-validation (</w:t>
-      </w:r>
-      <w:hyperlink w:anchor="tbl-loco">
-        <w:r>
-          <w:rPr>
-            <w:rStyle w:val="Hyperlink"/>
-          </w:rPr>
-          <w:t xml:space="preserve">Table 4</w:t>
-        </w:r>
-      </w:hyperlink>
-      <w:r>
-        <w:t xml:space="preserve">;</w:t>
-      </w:r>
-      <w:r>
-        <w:t xml:space="preserve"> </w:t>
-      </w:r>
-      <w:hyperlink w:anchor="fig-loco-scatter">
-        <w:r>
-          <w:rPr>
-            <w:rStyle w:val="Hyperlink"/>
-          </w:rPr>
-          <w:t xml:space="preserve">Figure 1</w:t>
-        </w:r>
-      </w:hyperlink>
-      <w:r>
-        <w:t xml:space="preserve">). Across the 16</w:t>
-      </w:r>
-      <w:r>
-        <w:t xml:space="preserve"> </w:t>
-      </w:r>
-      <w:r>
-        <w:t xml:space="preserve">outcome–holdout combinations, Pearson r had a median of 0.29 and ranged</w:t>
-      </w:r>
-      <w:r>
-        <w:t xml:space="preserve"> </w:t>
-      </w:r>
-      <w:r>
-        <w:t xml:space="preserve">from −0.21 to 0.75, with iron deficiency outcomes transporting best (median r</w:t>
-      </w:r>
-      <w:r>
-        <w:t xml:space="preserve"> </w:t>
-      </w:r>
-      <w:r>
-        <w:t xml:space="preserve">0.35 in children, 0.22 in women) and vitamin-A outcomes weaker (median r</w:t>
-      </w:r>
-      <w:r>
-        <w:t xml:space="preserve"> </w:t>
-      </w:r>
-      <w:r>
-        <w:t xml:space="preserve">0.24 in children, 0.37 in women), with anti-predictive ordering in some</w:t>
-      </w:r>
-      <w:r>
-        <w:t xml:space="preserve"> </w:t>
-      </w:r>
-      <w:r>
-        <w:t xml:space="preserve">holdouts.</w:t>
-      </w:r>
-    </w:p>
-    <w:p>
-      <w:pPr>
-        <w:pStyle w:val="BodyText"/>
-      </w:pPr>
-      <w:r>
-        <w:t xml:space="preserve">The area-level recipe, applied with the universal (earth-observation-only)</w:t>
-      </w:r>
-      <w:r>
-        <w:t xml:space="preserve"> </w:t>
-      </w:r>
-      <w:r>
-        <w:t xml:space="preserve">feature set and scored by rank correlation, produced comparable point</w:t>
-      </w:r>
-      <w:r>
-        <w:t xml:space="preserve"> </w:t>
-      </w:r>
-      <w:r>
-        <w:t xml:space="preserve">estimates to within-country cross-validation (Spearman 0.42 and 0.49 for</w:t>
-      </w:r>
-      <w:r>
-        <w:t xml:space="preserve"> </w:t>
-      </w:r>
-      <w:r>
-        <w:t xml:space="preserve">child iron, 0.75 and 0.35 for women’s iron, in Gambia and Ghana respectively)</w:t>
-      </w:r>
-      <w:r>
-        <w:t xml:space="preserve"> </w:t>
-      </w:r>
-      <w:r>
-        <w:t xml:space="preserve">but not to Malawi (Spearman ≈ 0.03–0.05), and vitamin A did not transport</w:t>
-      </w:r>
-      <w:r>
-        <w:t xml:space="preserve"> </w:t>
-      </w:r>
-      <w:r>
-        <w:t xml:space="preserve">well in any country. As noted above (</w:t>
-      </w:r>
-      <w:hyperlink w:anchor="sec-recipe-audit">
-        <w:r>
-          <w:rPr>
-            <w:rStyle w:val="Hyperlink"/>
-          </w:rPr>
-          <w:t xml:space="preserve">Section 3.4</w:t>
-        </w:r>
-      </w:hyperlink>
-      <w:r>
-        <w:t xml:space="preserve">), the recipe’s</w:t>
-      </w:r>
-      <w:r>
-        <w:t xml:space="preserve"> </w:t>
-      </w:r>
-      <w:r>
-        <w:t xml:space="preserve">apparent edge over simpler comparators does not survive a leakage-corrected</w:t>
-      </w:r>
-      <w:r>
-        <w:t xml:space="preserve"> </w:t>
-      </w:r>
-      <w:r>
-        <w:t xml:space="preserve">re-ranking, so we read these numbers as descriptive of the recipe’s own</w:t>
-      </w:r>
-      <w:r>
-        <w:t xml:space="preserve"> </w:t>
-      </w:r>
-      <w:r>
-        <w:t xml:space="preserve">LOCO behaviour rather than as evidence that it out-transports the benchmark</w:t>
-      </w:r>
-      <w:r>
-        <w:t xml:space="preserve"> </w:t>
-      </w:r>
-      <w:r>
-        <w:t xml:space="preserve">methods in</w:t>
-      </w:r>
-      <w:r>
-        <w:t xml:space="preserve"> </w:t>
-      </w:r>
-      <w:hyperlink w:anchor="tbl-benchmarks">
-        <w:r>
-          <w:rPr>
-            <w:rStyle w:val="Hyperlink"/>
-          </w:rPr>
-          <w:t xml:space="preserve">Table 6</w:t>
-        </w:r>
-      </w:hyperlink>
-      <w:r>
-        <w:t xml:space="preserve">. The malaria/IHME enrichment that aided</w:t>
-      </w:r>
-      <w:r>
-        <w:t xml:space="preserve"> </w:t>
-      </w:r>
-      <w:r>
-        <w:t xml:space="preserve">within-country prediction</w:t>
-      </w:r>
-      <w:r>
-        <w:t xml:space="preserve"> </w:t>
-      </w:r>
-      <w:r>
-        <w:rPr>
-          <w:i/>
-          <w:iCs/>
-        </w:rPr>
-        <w:t xml:space="preserve">degraded</w:t>
-      </w:r>
-      <w:r>
-        <w:t xml:space="preserve"> </w:t>
-      </w:r>
-      <w:r>
-        <w:t xml:space="preserve">transport (mean child-iron Spearman 0.30</w:t>
-      </w:r>
-      <w:r>
-        <w:t xml:space="preserve"> </w:t>
-      </w:r>
-      <w:r>
-        <w:t xml:space="preserve">with universal features versus 0.20 enriched), because the malaria–iron and</w:t>
-      </w:r>
-      <w:r>
-        <w:t xml:space="preserve"> </w:t>
-      </w:r>
-      <w:r>
-        <w:t xml:space="preserve">modelled-burden relationships are country-specific rather than universal.</w:t>
-      </w:r>
-      <w:r>
-        <w:t xml:space="preserve"> </w:t>
-      </w:r>
-      <w:r>
-        <w:t xml:space="preserve">Cross-country prediction is therefore, at best, a ranking-only product, valid</w:t>
-      </w:r>
-      <w:r>
-        <w:t xml:space="preserve"> </w:t>
-      </w:r>
-      <w:r>
-        <w:t xml:space="preserve">within an epidemiologically similar neighbourhood with adequate covariate</w:t>
-      </w:r>
-      <w:r>
-        <w:t xml:space="preserve"> </w:t>
-      </w:r>
-      <w:r>
-        <w:t xml:space="preserve">coverage and requiring national-anchor calibration to recover the absolute</w:t>
-      </w:r>
-      <w:r>
-        <w:t xml:space="preserve"> </w:t>
-      </w:r>
-      <w:r>
-        <w:t xml:space="preserve">level.</w:t>
       </w:r>
     </w:p>
     <w:tbl>
@@ -31996,7 +31772,2934 @@
       <w:tr>
         <w:tc>
           <w:tcPr/>
-          <w:bookmarkStart w:id="33" w:name="tbl-loco"/>
+          <w:bookmarkStart w:id="32" w:name="tbl-area-recipe"/>
+          <w:p>
+            <w:pPr>
+              <w:jc w:val="center"/>
+            </w:pPr>
+            <w:pPr>
+              <w:jc w:val="start"/>
+              <w:spacing w:before="200"/>
+              <w:pStyle w:val="ImageCaption"/>
+            </w:pPr>
+            <w:r>
+              <w:t xml:space="preserve">Table 3: Area-level recipe within-country performance (binomial loss, enriched features), district- and region-block cross-validation. Pearson r with area-bootstrap 95% CI and permutation-null p; calibration slope. From results/tables/corrected/area_recipe_within.csv.</w:t>
+            </w:r>
+          </w:p>
+          <w:tbl>
+            <w:tblPr>
+              <w:tblStyle w:val="Table"/>
+              <w:tblW w:type="pct" w:w="5000"/>
+              <w:tblLayout w:type="fixed"/>
+              <w:tblLook w:firstRow="1" w:lastRow="0" w:firstColumn="0" w:lastColumn="0" w:noHBand="0" w:noVBand="0" w:val="0020"/>
+            </w:tblPr>
+            <w:tblGrid>
+              <w:gridCol w:w="1430"/>
+              <w:gridCol w:w="1430"/>
+              <w:gridCol w:w="990"/>
+              <w:gridCol w:w="330"/>
+              <w:gridCol w:w="660"/>
+              <w:gridCol w:w="1650"/>
+              <w:gridCol w:w="770"/>
+              <w:gridCol w:w="660"/>
+            </w:tblGrid>
+            <w:tr>
+              <w:trPr>
+                <w:tblHeader w:val="on"/>
+              </w:trPr>
+              <w:tc>
+                <w:tcPr/>
+                <w:p>
+                  <w:pPr>
+                    <w:pStyle w:val="Compact"/>
+                    <w:jc w:val="left"/>
+                    <w:jc w:val="center"/>
+                  </w:pPr>
+                  <w:r>
+                    <w:t xml:space="preserve">Country</w:t>
+                  </w:r>
+                </w:p>
+              </w:tc>
+              <w:tc>
+                <w:tcPr/>
+                <w:p>
+                  <w:pPr>
+                    <w:pStyle w:val="Compact"/>
+                    <w:jc w:val="left"/>
+                    <w:jc w:val="center"/>
+                  </w:pPr>
+                  <w:r>
+                    <w:t xml:space="preserve">Outcome</w:t>
+                  </w:r>
+                </w:p>
+              </w:tc>
+              <w:tc>
+                <w:tcPr/>
+                <w:p>
+                  <w:pPr>
+                    <w:pStyle w:val="Compact"/>
+                    <w:jc w:val="left"/>
+                    <w:jc w:val="center"/>
+                  </w:pPr>
+                  <w:r>
+                    <w:t xml:space="preserve">Scheme</w:t>
+                  </w:r>
+                </w:p>
+              </w:tc>
+              <w:tc>
+                <w:tcPr/>
+                <w:p>
+                  <w:pPr>
+                    <w:pStyle w:val="Compact"/>
+                    <w:jc w:val="right"/>
+                    <w:jc w:val="center"/>
+                  </w:pPr>
+                  <w:r>
+                    <w:t xml:space="preserve">n</w:t>
+                  </w:r>
+                </w:p>
+              </w:tc>
+              <w:tc>
+                <w:tcPr/>
+                <w:p>
+                  <w:pPr>
+                    <w:pStyle w:val="Compact"/>
+                    <w:jc w:val="right"/>
+                    <w:jc w:val="center"/>
+                  </w:pPr>
+                  <w:r>
+                    <w:t xml:space="preserve">r</w:t>
+                  </w:r>
+                </w:p>
+              </w:tc>
+              <w:tc>
+                <w:tcPr/>
+                <w:p>
+                  <w:pPr>
+                    <w:pStyle w:val="Compact"/>
+                    <w:jc w:val="left"/>
+                    <w:jc w:val="center"/>
+                  </w:pPr>
+                  <w:r>
+                    <w:t xml:space="preserve">95% CI</w:t>
+                  </w:r>
+                </w:p>
+              </w:tc>
+              <w:tc>
+                <w:tcPr/>
+                <w:p>
+                  <w:pPr>
+                    <w:pStyle w:val="Compact"/>
+                    <w:jc w:val="right"/>
+                    <w:jc w:val="center"/>
+                  </w:pPr>
+                  <w:r>
+                    <w:t xml:space="preserve">perm p</w:t>
+                  </w:r>
+                </w:p>
+              </w:tc>
+              <w:tc>
+                <w:tcPr/>
+                <w:p>
+                  <w:pPr>
+                    <w:pStyle w:val="Compact"/>
+                    <w:jc w:val="right"/>
+                    <w:jc w:val="center"/>
+                  </w:pPr>
+                  <w:r>
+                    <w:t xml:space="preserve">Slope</w:t>
+                  </w:r>
+                </w:p>
+              </w:tc>
+            </w:tr>
+            <w:tr>
+              <w:tc>
+                <w:tcPr/>
+                <w:p>
+                  <w:pPr>
+                    <w:pStyle w:val="Compact"/>
+                    <w:jc w:val="left"/>
+                    <w:jc w:val="center"/>
+                  </w:pPr>
+                  <w:r>
+                    <w:t xml:space="preserve">Gambia</w:t>
+                  </w:r>
+                </w:p>
+              </w:tc>
+              <w:tc>
+                <w:tcPr/>
+                <w:p>
+                  <w:pPr>
+                    <w:pStyle w:val="Compact"/>
+                    <w:jc w:val="left"/>
+                    <w:jc w:val="center"/>
+                  </w:pPr>
+                  <w:r>
+                    <w:t xml:space="preserve">child_iron</w:t>
+                  </w:r>
+                </w:p>
+              </w:tc>
+              <w:tc>
+                <w:tcPr/>
+                <w:p>
+                  <w:pPr>
+                    <w:pStyle w:val="Compact"/>
+                    <w:jc w:val="left"/>
+                    <w:jc w:val="center"/>
+                  </w:pPr>
+                  <w:r>
+                    <w:t xml:space="preserve">district</w:t>
+                  </w:r>
+                </w:p>
+              </w:tc>
+              <w:tc>
+                <w:tcPr/>
+                <w:p>
+                  <w:pPr>
+                    <w:pStyle w:val="Compact"/>
+                    <w:jc w:val="right"/>
+                    <w:jc w:val="center"/>
+                  </w:pPr>
+                  <w:r>
+                    <w:t xml:space="preserve">30</w:t>
+                  </w:r>
+                </w:p>
+              </w:tc>
+              <w:tc>
+                <w:tcPr/>
+                <w:p>
+                  <w:pPr>
+                    <w:pStyle w:val="Compact"/>
+                    <w:jc w:val="right"/>
+                    <w:jc w:val="center"/>
+                  </w:pPr>
+                  <w:r>
+                    <w:t xml:space="preserve">0.48</w:t>
+                  </w:r>
+                </w:p>
+              </w:tc>
+              <w:tc>
+                <w:tcPr/>
+                <w:p>
+                  <w:pPr>
+                    <w:pStyle w:val="Compact"/>
+                    <w:jc w:val="left"/>
+                    <w:jc w:val="center"/>
+                  </w:pPr>
+                  <w:r>
+                    <w:t xml:space="preserve">[0.23, 0.70]</w:t>
+                  </w:r>
+                </w:p>
+              </w:tc>
+              <w:tc>
+                <w:tcPr/>
+                <w:p>
+                  <w:pPr>
+                    <w:pStyle w:val="Compact"/>
+                    <w:jc w:val="right"/>
+                    <w:jc w:val="center"/>
+                  </w:pPr>
+                  <w:r>
+                    <w:t xml:space="preserve">0.005</w:t>
+                  </w:r>
+                </w:p>
+              </w:tc>
+              <w:tc>
+                <w:tcPr/>
+                <w:p>
+                  <w:pPr>
+                    <w:pStyle w:val="Compact"/>
+                    <w:jc w:val="right"/>
+                    <w:jc w:val="center"/>
+                  </w:pPr>
+                  <w:r>
+                    <w:t xml:space="preserve">0.94</w:t>
+                  </w:r>
+                </w:p>
+              </w:tc>
+            </w:tr>
+            <w:tr>
+              <w:tc>
+                <w:tcPr/>
+                <w:p>
+                  <w:pPr>
+                    <w:pStyle w:val="Compact"/>
+                    <w:jc w:val="left"/>
+                    <w:jc w:val="center"/>
+                  </w:pPr>
+                  <w:r>
+                    <w:t xml:space="preserve">Gambia</w:t>
+                  </w:r>
+                </w:p>
+              </w:tc>
+              <w:tc>
+                <w:tcPr/>
+                <w:p>
+                  <w:pPr>
+                    <w:pStyle w:val="Compact"/>
+                    <w:jc w:val="left"/>
+                    <w:jc w:val="center"/>
+                  </w:pPr>
+                  <w:r>
+                    <w:t xml:space="preserve">child_vitA</w:t>
+                  </w:r>
+                </w:p>
+              </w:tc>
+              <w:tc>
+                <w:tcPr/>
+                <w:p>
+                  <w:pPr>
+                    <w:pStyle w:val="Compact"/>
+                    <w:jc w:val="left"/>
+                    <w:jc w:val="center"/>
+                  </w:pPr>
+                  <w:r>
+                    <w:t xml:space="preserve">district</w:t>
+                  </w:r>
+                </w:p>
+              </w:tc>
+              <w:tc>
+                <w:tcPr/>
+                <w:p>
+                  <w:pPr>
+                    <w:pStyle w:val="Compact"/>
+                    <w:jc w:val="right"/>
+                    <w:jc w:val="center"/>
+                  </w:pPr>
+                  <w:r>
+                    <w:t xml:space="preserve">30</w:t>
+                  </w:r>
+                </w:p>
+              </w:tc>
+              <w:tc>
+                <w:tcPr/>
+                <w:p>
+                  <w:pPr>
+                    <w:pStyle w:val="Compact"/>
+                    <w:jc w:val="right"/>
+                    <w:jc w:val="center"/>
+                  </w:pPr>
+                  <w:r>
+                    <w:t xml:space="preserve">0.18</w:t>
+                  </w:r>
+                </w:p>
+              </w:tc>
+              <w:tc>
+                <w:tcPr/>
+                <w:p>
+                  <w:pPr>
+                    <w:pStyle w:val="Compact"/>
+                    <w:jc w:val="left"/>
+                    <w:jc w:val="center"/>
+                  </w:pPr>
+                  <w:r>
+                    <w:t xml:space="preserve">[-0.13, 0.49]</w:t>
+                  </w:r>
+                </w:p>
+              </w:tc>
+              <w:tc>
+                <w:tcPr/>
+                <w:p>
+                  <w:pPr>
+                    <w:pStyle w:val="Compact"/>
+                    <w:jc w:val="right"/>
+                    <w:jc w:val="center"/>
+                  </w:pPr>
+                  <w:r>
+                    <w:t xml:space="preserve">0.178</w:t>
+                  </w:r>
+                </w:p>
+              </w:tc>
+              <w:tc>
+                <w:tcPr/>
+                <w:p>
+                  <w:pPr>
+                    <w:pStyle w:val="Compact"/>
+                    <w:jc w:val="right"/>
+                    <w:jc w:val="center"/>
+                  </w:pPr>
+                  <w:r>
+                    <w:t xml:space="preserve">0.27</w:t>
+                  </w:r>
+                </w:p>
+              </w:tc>
+            </w:tr>
+            <w:tr>
+              <w:tc>
+                <w:tcPr/>
+                <w:p>
+                  <w:pPr>
+                    <w:pStyle w:val="Compact"/>
+                    <w:jc w:val="left"/>
+                    <w:jc w:val="center"/>
+                  </w:pPr>
+                  <w:r>
+                    <w:t xml:space="preserve">Gambia</w:t>
+                  </w:r>
+                </w:p>
+              </w:tc>
+              <w:tc>
+                <w:tcPr/>
+                <w:p>
+                  <w:pPr>
+                    <w:pStyle w:val="Compact"/>
+                    <w:jc w:val="left"/>
+                    <w:jc w:val="center"/>
+                  </w:pPr>
+                  <w:r>
+                    <w:t xml:space="preserve">women_iron</w:t>
+                  </w:r>
+                </w:p>
+              </w:tc>
+              <w:tc>
+                <w:tcPr/>
+                <w:p>
+                  <w:pPr>
+                    <w:pStyle w:val="Compact"/>
+                    <w:jc w:val="left"/>
+                    <w:jc w:val="center"/>
+                  </w:pPr>
+                  <w:r>
+                    <w:t xml:space="preserve">district</w:t>
+                  </w:r>
+                </w:p>
+              </w:tc>
+              <w:tc>
+                <w:tcPr/>
+                <w:p>
+                  <w:pPr>
+                    <w:pStyle w:val="Compact"/>
+                    <w:jc w:val="right"/>
+                    <w:jc w:val="center"/>
+                  </w:pPr>
+                  <w:r>
+                    <w:t xml:space="preserve">30</w:t>
+                  </w:r>
+                </w:p>
+              </w:tc>
+              <w:tc>
+                <w:tcPr/>
+                <w:p>
+                  <w:pPr>
+                    <w:pStyle w:val="Compact"/>
+                    <w:jc w:val="right"/>
+                    <w:jc w:val="center"/>
+                  </w:pPr>
+                  <w:r>
+                    <w:t xml:space="preserve">0.40</w:t>
+                  </w:r>
+                </w:p>
+              </w:tc>
+              <w:tc>
+                <w:tcPr/>
+                <w:p>
+                  <w:pPr>
+                    <w:pStyle w:val="Compact"/>
+                    <w:jc w:val="left"/>
+                    <w:jc w:val="center"/>
+                  </w:pPr>
+                  <w:r>
+                    <w:t xml:space="preserve">[0.15, 0.66]</w:t>
+                  </w:r>
+                </w:p>
+              </w:tc>
+              <w:tc>
+                <w:tcPr/>
+                <w:p>
+                  <w:pPr>
+                    <w:pStyle w:val="Compact"/>
+                    <w:jc w:val="right"/>
+                    <w:jc w:val="center"/>
+                  </w:pPr>
+                  <w:r>
+                    <w:t xml:space="preserve">0.011</w:t>
+                  </w:r>
+                </w:p>
+              </w:tc>
+              <w:tc>
+                <w:tcPr/>
+                <w:p>
+                  <w:pPr>
+                    <w:pStyle w:val="Compact"/>
+                    <w:jc w:val="right"/>
+                    <w:jc w:val="center"/>
+                  </w:pPr>
+                  <w:r>
+                    <w:t xml:space="preserve">0.66</w:t>
+                  </w:r>
+                </w:p>
+              </w:tc>
+            </w:tr>
+            <w:tr>
+              <w:tc>
+                <w:tcPr/>
+                <w:p>
+                  <w:pPr>
+                    <w:pStyle w:val="Compact"/>
+                    <w:jc w:val="left"/>
+                    <w:jc w:val="center"/>
+                  </w:pPr>
+                  <w:r>
+                    <w:t xml:space="preserve">Gambia</w:t>
+                  </w:r>
+                </w:p>
+              </w:tc>
+              <w:tc>
+                <w:tcPr/>
+                <w:p>
+                  <w:pPr>
+                    <w:pStyle w:val="Compact"/>
+                    <w:jc w:val="left"/>
+                    <w:jc w:val="center"/>
+                  </w:pPr>
+                  <w:r>
+                    <w:t xml:space="preserve">women_vitA</w:t>
+                  </w:r>
+                </w:p>
+              </w:tc>
+              <w:tc>
+                <w:tcPr/>
+                <w:p>
+                  <w:pPr>
+                    <w:pStyle w:val="Compact"/>
+                    <w:jc w:val="left"/>
+                    <w:jc w:val="center"/>
+                  </w:pPr>
+                  <w:r>
+                    <w:t xml:space="preserve">district</w:t>
+                  </w:r>
+                </w:p>
+              </w:tc>
+              <w:tc>
+                <w:tcPr/>
+                <w:p>
+                  <w:pPr>
+                    <w:pStyle w:val="Compact"/>
+                    <w:jc w:val="right"/>
+                    <w:jc w:val="center"/>
+                  </w:pPr>
+                  <w:r>
+                    <w:t xml:space="preserve">30</w:t>
+                  </w:r>
+                </w:p>
+              </w:tc>
+              <w:tc>
+                <w:tcPr/>
+                <w:p>
+                  <w:pPr>
+                    <w:pStyle w:val="Compact"/>
+                    <w:jc w:val="right"/>
+                    <w:jc w:val="center"/>
+                  </w:pPr>
+                  <w:r>
+                    <w:t xml:space="preserve">0.32</w:t>
+                  </w:r>
+                </w:p>
+              </w:tc>
+              <w:tc>
+                <w:tcPr/>
+                <w:p>
+                  <w:pPr>
+                    <w:pStyle w:val="Compact"/>
+                    <w:jc w:val="left"/>
+                    <w:jc w:val="center"/>
+                  </w:pPr>
+                  <w:r>
+                    <w:t xml:space="preserve">[0.04, 0.62]</w:t>
+                  </w:r>
+                </w:p>
+              </w:tc>
+              <w:tc>
+                <w:tcPr/>
+                <w:p>
+                  <w:pPr>
+                    <w:pStyle w:val="Compact"/>
+                    <w:jc w:val="right"/>
+                    <w:jc w:val="center"/>
+                  </w:pPr>
+                  <w:r>
+                    <w:t xml:space="preserve">0.059</w:t>
+                  </w:r>
+                </w:p>
+              </w:tc>
+              <w:tc>
+                <w:tcPr/>
+                <w:p>
+                  <w:pPr>
+                    <w:pStyle w:val="Compact"/>
+                    <w:jc w:val="right"/>
+                    <w:jc w:val="center"/>
+                  </w:pPr>
+                  <w:r>
+                    <w:t xml:space="preserve">0.80</w:t>
+                  </w:r>
+                </w:p>
+              </w:tc>
+            </w:tr>
+            <w:tr>
+              <w:tc>
+                <w:tcPr/>
+                <w:p>
+                  <w:pPr>
+                    <w:pStyle w:val="Compact"/>
+                    <w:jc w:val="left"/>
+                    <w:jc w:val="center"/>
+                  </w:pPr>
+                  <w:r>
+                    <w:t xml:space="preserve">Ghana</w:t>
+                  </w:r>
+                </w:p>
+              </w:tc>
+              <w:tc>
+                <w:tcPr/>
+                <w:p>
+                  <w:pPr>
+                    <w:pStyle w:val="Compact"/>
+                    <w:jc w:val="left"/>
+                    <w:jc w:val="center"/>
+                  </w:pPr>
+                  <w:r>
+                    <w:t xml:space="preserve">child_iron</w:t>
+                  </w:r>
+                </w:p>
+              </w:tc>
+              <w:tc>
+                <w:tcPr/>
+                <w:p>
+                  <w:pPr>
+                    <w:pStyle w:val="Compact"/>
+                    <w:jc w:val="left"/>
+                    <w:jc w:val="center"/>
+                  </w:pPr>
+                  <w:r>
+                    <w:t xml:space="preserve">district</w:t>
+                  </w:r>
+                </w:p>
+              </w:tc>
+              <w:tc>
+                <w:tcPr/>
+                <w:p>
+                  <w:pPr>
+                    <w:pStyle w:val="Compact"/>
+                    <w:jc w:val="right"/>
+                    <w:jc w:val="center"/>
+                  </w:pPr>
+                  <w:r>
+                    <w:t xml:space="preserve">71</w:t>
+                  </w:r>
+                </w:p>
+              </w:tc>
+              <w:tc>
+                <w:tcPr/>
+                <w:p>
+                  <w:pPr>
+                    <w:pStyle w:val="Compact"/>
+                    <w:jc w:val="right"/>
+                    <w:jc w:val="center"/>
+                  </w:pPr>
+                  <w:r>
+                    <w:t xml:space="preserve">0.62</w:t>
+                  </w:r>
+                </w:p>
+              </w:tc>
+              <w:tc>
+                <w:tcPr/>
+                <w:p>
+                  <w:pPr>
+                    <w:pStyle w:val="Compact"/>
+                    <w:jc w:val="left"/>
+                    <w:jc w:val="center"/>
+                  </w:pPr>
+                  <w:r>
+                    <w:t xml:space="preserve">[0.49, 0.74]</w:t>
+                  </w:r>
+                </w:p>
+              </w:tc>
+              <w:tc>
+                <w:tcPr/>
+                <w:p>
+                  <w:pPr>
+                    <w:pStyle w:val="Compact"/>
+                    <w:jc w:val="right"/>
+                    <w:jc w:val="center"/>
+                  </w:pPr>
+                  <w:r>
+                    <w:t xml:space="preserve">0.001</w:t>
+                  </w:r>
+                </w:p>
+              </w:tc>
+              <w:tc>
+                <w:tcPr/>
+                <w:p>
+                  <w:pPr>
+                    <w:pStyle w:val="Compact"/>
+                    <w:jc w:val="right"/>
+                    <w:jc w:val="center"/>
+                  </w:pPr>
+                  <w:r>
+                    <w:t xml:space="preserve">0.82</w:t>
+                  </w:r>
+                </w:p>
+              </w:tc>
+            </w:tr>
+            <w:tr>
+              <w:tc>
+                <w:tcPr/>
+                <w:p>
+                  <w:pPr>
+                    <w:pStyle w:val="Compact"/>
+                    <w:jc w:val="left"/>
+                    <w:jc w:val="center"/>
+                  </w:pPr>
+                  <w:r>
+                    <w:t xml:space="preserve">Ghana</w:t>
+                  </w:r>
+                </w:p>
+              </w:tc>
+              <w:tc>
+                <w:tcPr/>
+                <w:p>
+                  <w:pPr>
+                    <w:pStyle w:val="Compact"/>
+                    <w:jc w:val="left"/>
+                    <w:jc w:val="center"/>
+                  </w:pPr>
+                  <w:r>
+                    <w:t xml:space="preserve">child_vitA</w:t>
+                  </w:r>
+                </w:p>
+              </w:tc>
+              <w:tc>
+                <w:tcPr/>
+                <w:p>
+                  <w:pPr>
+                    <w:pStyle w:val="Compact"/>
+                    <w:jc w:val="left"/>
+                    <w:jc w:val="center"/>
+                  </w:pPr>
+                  <w:r>
+                    <w:t xml:space="preserve">district</w:t>
+                  </w:r>
+                </w:p>
+              </w:tc>
+              <w:tc>
+                <w:tcPr/>
+                <w:p>
+                  <w:pPr>
+                    <w:pStyle w:val="Compact"/>
+                    <w:jc w:val="right"/>
+                    <w:jc w:val="center"/>
+                  </w:pPr>
+                  <w:r>
+                    <w:t xml:space="preserve">71</w:t>
+                  </w:r>
+                </w:p>
+              </w:tc>
+              <w:tc>
+                <w:tcPr/>
+                <w:p>
+                  <w:pPr>
+                    <w:pStyle w:val="Compact"/>
+                    <w:jc w:val="right"/>
+                    <w:jc w:val="center"/>
+                  </w:pPr>
+                  <w:r>
+                    <w:t xml:space="preserve">0.18</w:t>
+                  </w:r>
+                </w:p>
+              </w:tc>
+              <w:tc>
+                <w:tcPr/>
+                <w:p>
+                  <w:pPr>
+                    <w:pStyle w:val="Compact"/>
+                    <w:jc w:val="left"/>
+                    <w:jc w:val="center"/>
+                  </w:pPr>
+                  <w:r>
+                    <w:t xml:space="preserve">[-0.05, 0.39]</w:t>
+                  </w:r>
+                </w:p>
+              </w:tc>
+              <w:tc>
+                <w:tcPr/>
+                <w:p>
+                  <w:pPr>
+                    <w:pStyle w:val="Compact"/>
+                    <w:jc w:val="right"/>
+                    <w:jc w:val="center"/>
+                  </w:pPr>
+                  <w:r>
+                    <w:t xml:space="preserve">0.066</w:t>
+                  </w:r>
+                </w:p>
+              </w:tc>
+              <w:tc>
+                <w:tcPr/>
+                <w:p>
+                  <w:pPr>
+                    <w:pStyle w:val="Compact"/>
+                    <w:jc w:val="right"/>
+                    <w:jc w:val="center"/>
+                  </w:pPr>
+                  <w:r>
+                    <w:t xml:space="preserve">0.42</w:t>
+                  </w:r>
+                </w:p>
+              </w:tc>
+            </w:tr>
+            <w:tr>
+              <w:tc>
+                <w:tcPr/>
+                <w:p>
+                  <w:pPr>
+                    <w:pStyle w:val="Compact"/>
+                    <w:jc w:val="left"/>
+                    <w:jc w:val="center"/>
+                  </w:pPr>
+                  <w:r>
+                    <w:t xml:space="preserve">Ghana</w:t>
+                  </w:r>
+                </w:p>
+              </w:tc>
+              <w:tc>
+                <w:tcPr/>
+                <w:p>
+                  <w:pPr>
+                    <w:pStyle w:val="Compact"/>
+                    <w:jc w:val="left"/>
+                    <w:jc w:val="center"/>
+                  </w:pPr>
+                  <w:r>
+                    <w:t xml:space="preserve">women_b12</w:t>
+                  </w:r>
+                </w:p>
+              </w:tc>
+              <w:tc>
+                <w:tcPr/>
+                <w:p>
+                  <w:pPr>
+                    <w:pStyle w:val="Compact"/>
+                    <w:jc w:val="left"/>
+                    <w:jc w:val="center"/>
+                  </w:pPr>
+                  <w:r>
+                    <w:t xml:space="preserve">district</w:t>
+                  </w:r>
+                </w:p>
+              </w:tc>
+              <w:tc>
+                <w:tcPr/>
+                <w:p>
+                  <w:pPr>
+                    <w:pStyle w:val="Compact"/>
+                    <w:jc w:val="right"/>
+                    <w:jc w:val="center"/>
+                  </w:pPr>
+                  <w:r>
+                    <w:t xml:space="preserve">51</w:t>
+                  </w:r>
+                </w:p>
+              </w:tc>
+              <w:tc>
+                <w:tcPr/>
+                <w:p>
+                  <w:pPr>
+                    <w:pStyle w:val="Compact"/>
+                    <w:jc w:val="right"/>
+                    <w:jc w:val="center"/>
+                  </w:pPr>
+                  <w:r>
+                    <w:t xml:space="preserve">0.57</w:t>
+                  </w:r>
+                </w:p>
+              </w:tc>
+              <w:tc>
+                <w:tcPr/>
+                <w:p>
+                  <w:pPr>
+                    <w:pStyle w:val="Compact"/>
+                    <w:jc w:val="left"/>
+                    <w:jc w:val="center"/>
+                  </w:pPr>
+                  <w:r>
+                    <w:t xml:space="preserve">[0.21, 0.78]</w:t>
+                  </w:r>
+                </w:p>
+              </w:tc>
+              <w:tc>
+                <w:tcPr/>
+                <w:p>
+                  <w:pPr>
+                    <w:pStyle w:val="Compact"/>
+                    <w:jc w:val="right"/>
+                    <w:jc w:val="center"/>
+                  </w:pPr>
+                  <w:r>
+                    <w:t xml:space="preserve">0.001</w:t>
+                  </w:r>
+                </w:p>
+              </w:tc>
+              <w:tc>
+                <w:tcPr/>
+                <w:p>
+                  <w:pPr>
+                    <w:pStyle w:val="Compact"/>
+                    <w:jc w:val="right"/>
+                    <w:jc w:val="center"/>
+                  </w:pPr>
+                  <w:r>
+                    <w:t xml:space="preserve">1.07</w:t>
+                  </w:r>
+                </w:p>
+              </w:tc>
+            </w:tr>
+            <w:tr>
+              <w:tc>
+                <w:tcPr/>
+                <w:p>
+                  <w:pPr>
+                    <w:pStyle w:val="Compact"/>
+                    <w:jc w:val="left"/>
+                    <w:jc w:val="center"/>
+                  </w:pPr>
+                  <w:r>
+                    <w:t xml:space="preserve">Ghana</w:t>
+                  </w:r>
+                </w:p>
+              </w:tc>
+              <w:tc>
+                <w:tcPr/>
+                <w:p>
+                  <w:pPr>
+                    <w:pStyle w:val="Compact"/>
+                    <w:jc w:val="left"/>
+                    <w:jc w:val="center"/>
+                  </w:pPr>
+                  <w:r>
+                    <w:t xml:space="preserve">women_folate</w:t>
+                  </w:r>
+                </w:p>
+              </w:tc>
+              <w:tc>
+                <w:tcPr/>
+                <w:p>
+                  <w:pPr>
+                    <w:pStyle w:val="Compact"/>
+                    <w:jc w:val="left"/>
+                    <w:jc w:val="center"/>
+                  </w:pPr>
+                  <w:r>
+                    <w:t xml:space="preserve">district</w:t>
+                  </w:r>
+                </w:p>
+              </w:tc>
+              <w:tc>
+                <w:tcPr/>
+                <w:p>
+                  <w:pPr>
+                    <w:pStyle w:val="Compact"/>
+                    <w:jc w:val="right"/>
+                    <w:jc w:val="center"/>
+                  </w:pPr>
+                  <w:r>
+                    <w:t xml:space="preserve">52</w:t>
+                  </w:r>
+                </w:p>
+              </w:tc>
+              <w:tc>
+                <w:tcPr/>
+                <w:p>
+                  <w:pPr>
+                    <w:pStyle w:val="Compact"/>
+                    <w:jc w:val="right"/>
+                    <w:jc w:val="center"/>
+                  </w:pPr>
+                  <w:r>
+                    <w:t xml:space="preserve">-0.08</w:t>
+                  </w:r>
+                </w:p>
+              </w:tc>
+              <w:tc>
+                <w:tcPr/>
+                <w:p>
+                  <w:pPr>
+                    <w:pStyle w:val="Compact"/>
+                    <w:jc w:val="left"/>
+                    <w:jc w:val="center"/>
+                  </w:pPr>
+                  <w:r>
+                    <w:t xml:space="preserve">[-0.38, 0.16]</w:t>
+                  </w:r>
+                </w:p>
+              </w:tc>
+              <w:tc>
+                <w:tcPr/>
+                <w:p>
+                  <w:pPr>
+                    <w:pStyle w:val="Compact"/>
+                    <w:jc w:val="right"/>
+                    <w:jc w:val="center"/>
+                  </w:pPr>
+                  <w:r>
+                    <w:t xml:space="preserve">0.711</w:t>
+                  </w:r>
+                </w:p>
+              </w:tc>
+              <w:tc>
+                <w:tcPr/>
+                <w:p>
+                  <w:pPr>
+                    <w:pStyle w:val="Compact"/>
+                    <w:jc w:val="right"/>
+                    <w:jc w:val="center"/>
+                  </w:pPr>
+                  <w:r>
+                    <w:t xml:space="preserve">-0.16</w:t>
+                  </w:r>
+                </w:p>
+              </w:tc>
+            </w:tr>
+            <w:tr>
+              <w:tc>
+                <w:tcPr/>
+                <w:p>
+                  <w:pPr>
+                    <w:pStyle w:val="Compact"/>
+                    <w:jc w:val="left"/>
+                    <w:jc w:val="center"/>
+                  </w:pPr>
+                  <w:r>
+                    <w:t xml:space="preserve">Ghana</w:t>
+                  </w:r>
+                </w:p>
+              </w:tc>
+              <w:tc>
+                <w:tcPr/>
+                <w:p>
+                  <w:pPr>
+                    <w:pStyle w:val="Compact"/>
+                    <w:jc w:val="left"/>
+                    <w:jc w:val="center"/>
+                  </w:pPr>
+                  <w:r>
+                    <w:t xml:space="preserve">women_iron</w:t>
+                  </w:r>
+                </w:p>
+              </w:tc>
+              <w:tc>
+                <w:tcPr/>
+                <w:p>
+                  <w:pPr>
+                    <w:pStyle w:val="Compact"/>
+                    <w:jc w:val="left"/>
+                    <w:jc w:val="center"/>
+                  </w:pPr>
+                  <w:r>
+                    <w:t xml:space="preserve">district</w:t>
+                  </w:r>
+                </w:p>
+              </w:tc>
+              <w:tc>
+                <w:tcPr/>
+                <w:p>
+                  <w:pPr>
+                    <w:pStyle w:val="Compact"/>
+                    <w:jc w:val="right"/>
+                    <w:jc w:val="center"/>
+                  </w:pPr>
+                  <w:r>
+                    <w:t xml:space="preserve">72</w:t>
+                  </w:r>
+                </w:p>
+              </w:tc>
+              <w:tc>
+                <w:tcPr/>
+                <w:p>
+                  <w:pPr>
+                    <w:pStyle w:val="Compact"/>
+                    <w:jc w:val="right"/>
+                    <w:jc w:val="center"/>
+                  </w:pPr>
+                  <w:r>
+                    <w:t xml:space="preserve">0.39</w:t>
+                  </w:r>
+                </w:p>
+              </w:tc>
+              <w:tc>
+                <w:tcPr/>
+                <w:p>
+                  <w:pPr>
+                    <w:pStyle w:val="Compact"/>
+                    <w:jc w:val="left"/>
+                    <w:jc w:val="center"/>
+                  </w:pPr>
+                  <w:r>
+                    <w:t xml:space="preserve">[0.18, 0.56]</w:t>
+                  </w:r>
+                </w:p>
+              </w:tc>
+              <w:tc>
+                <w:tcPr/>
+                <w:p>
+                  <w:pPr>
+                    <w:pStyle w:val="Compact"/>
+                    <w:jc w:val="right"/>
+                    <w:jc w:val="center"/>
+                  </w:pPr>
+                  <w:r>
+                    <w:t xml:space="preserve">0.001</w:t>
+                  </w:r>
+                </w:p>
+              </w:tc>
+              <w:tc>
+                <w:tcPr/>
+                <w:p>
+                  <w:pPr>
+                    <w:pStyle w:val="Compact"/>
+                    <w:jc w:val="right"/>
+                    <w:jc w:val="center"/>
+                  </w:pPr>
+                  <w:r>
+                    <w:t xml:space="preserve">0.86</w:t>
+                  </w:r>
+                </w:p>
+              </w:tc>
+            </w:tr>
+            <w:tr>
+              <w:tc>
+                <w:tcPr/>
+                <w:p>
+                  <w:pPr>
+                    <w:pStyle w:val="Compact"/>
+                    <w:jc w:val="left"/>
+                    <w:jc w:val="center"/>
+                  </w:pPr>
+                  <w:r>
+                    <w:t xml:space="preserve">Ghana</w:t>
+                  </w:r>
+                </w:p>
+              </w:tc>
+              <w:tc>
+                <w:tcPr/>
+                <w:p>
+                  <w:pPr>
+                    <w:pStyle w:val="Compact"/>
+                    <w:jc w:val="left"/>
+                    <w:jc w:val="center"/>
+                  </w:pPr>
+                  <w:r>
+                    <w:t xml:space="preserve">women_vitA</w:t>
+                  </w:r>
+                </w:p>
+              </w:tc>
+              <w:tc>
+                <w:tcPr/>
+                <w:p>
+                  <w:pPr>
+                    <w:pStyle w:val="Compact"/>
+                    <w:jc w:val="left"/>
+                    <w:jc w:val="center"/>
+                  </w:pPr>
+                  <w:r>
+                    <w:t xml:space="preserve">district</w:t>
+                  </w:r>
+                </w:p>
+              </w:tc>
+              <w:tc>
+                <w:tcPr/>
+                <w:p>
+                  <w:pPr>
+                    <w:pStyle w:val="Compact"/>
+                    <w:jc w:val="right"/>
+                    <w:jc w:val="center"/>
+                  </w:pPr>
+                  <w:r>
+                    <w:t xml:space="preserve">72</w:t>
+                  </w:r>
+                </w:p>
+              </w:tc>
+              <w:tc>
+                <w:tcPr/>
+                <w:p>
+                  <w:pPr>
+                    <w:pStyle w:val="Compact"/>
+                    <w:jc w:val="right"/>
+                    <w:jc w:val="center"/>
+                  </w:pPr>
+                  <w:r>
+                    <w:t xml:space="preserve">-0.15</w:t>
+                  </w:r>
+                </w:p>
+              </w:tc>
+              <w:tc>
+                <w:tcPr/>
+                <w:p>
+                  <w:pPr>
+                    <w:pStyle w:val="Compact"/>
+                    <w:jc w:val="left"/>
+                    <w:jc w:val="center"/>
+                  </w:pPr>
+                  <w:r>
+                    <w:t xml:space="preserve">[-0.31, -0.05]</w:t>
+                  </w:r>
+                </w:p>
+              </w:tc>
+              <w:tc>
+                <w:tcPr/>
+                <w:p>
+                  <w:pPr>
+                    <w:pStyle w:val="Compact"/>
+                    <w:jc w:val="right"/>
+                    <w:jc w:val="center"/>
+                  </w:pPr>
+                  <w:r>
+                    <w:t xml:space="preserve">0.956</w:t>
+                  </w:r>
+                </w:p>
+              </w:tc>
+              <w:tc>
+                <w:tcPr/>
+                <w:p>
+                  <w:pPr>
+                    <w:pStyle w:val="Compact"/>
+                    <w:jc w:val="right"/>
+                    <w:jc w:val="center"/>
+                  </w:pPr>
+                  <w:r>
+                    <w:t xml:space="preserve">-0.91</w:t>
+                  </w:r>
+                </w:p>
+              </w:tc>
+            </w:tr>
+            <w:tr>
+              <w:tc>
+                <w:tcPr/>
+                <w:p>
+                  <w:pPr>
+                    <w:pStyle w:val="Compact"/>
+                    <w:jc w:val="left"/>
+                    <w:jc w:val="center"/>
+                  </w:pPr>
+                  <w:r>
+                    <w:t xml:space="preserve">Malawi</w:t>
+                  </w:r>
+                </w:p>
+              </w:tc>
+              <w:tc>
+                <w:tcPr/>
+                <w:p>
+                  <w:pPr>
+                    <w:pStyle w:val="Compact"/>
+                    <w:jc w:val="left"/>
+                    <w:jc w:val="center"/>
+                  </w:pPr>
+                  <w:r>
+                    <w:t xml:space="preserve">child_iron</w:t>
+                  </w:r>
+                </w:p>
+              </w:tc>
+              <w:tc>
+                <w:tcPr/>
+                <w:p>
+                  <w:pPr>
+                    <w:pStyle w:val="Compact"/>
+                    <w:jc w:val="left"/>
+                    <w:jc w:val="center"/>
+                  </w:pPr>
+                  <w:r>
+                    <w:t xml:space="preserve">district</w:t>
+                  </w:r>
+                </w:p>
+              </w:tc>
+              <w:tc>
+                <w:tcPr/>
+                <w:p>
+                  <w:pPr>
+                    <w:pStyle w:val="Compact"/>
+                    <w:jc w:val="right"/>
+                    <w:jc w:val="center"/>
+                  </w:pPr>
+                  <w:r>
+                    <w:t xml:space="preserve">86</w:t>
+                  </w:r>
+                </w:p>
+              </w:tc>
+              <w:tc>
+                <w:tcPr/>
+                <w:p>
+                  <w:pPr>
+                    <w:pStyle w:val="Compact"/>
+                    <w:jc w:val="right"/>
+                    <w:jc w:val="center"/>
+                  </w:pPr>
+                  <w:r>
+                    <w:t xml:space="preserve">0.28</w:t>
+                  </w:r>
+                </w:p>
+              </w:tc>
+              <w:tc>
+                <w:tcPr/>
+                <w:p>
+                  <w:pPr>
+                    <w:pStyle w:val="Compact"/>
+                    <w:jc w:val="left"/>
+                    <w:jc w:val="center"/>
+                  </w:pPr>
+                  <w:r>
+                    <w:t xml:space="preserve">[0.10, 0.46]</w:t>
+                  </w:r>
+                </w:p>
+              </w:tc>
+              <w:tc>
+                <w:tcPr/>
+                <w:p>
+                  <w:pPr>
+                    <w:pStyle w:val="Compact"/>
+                    <w:jc w:val="right"/>
+                    <w:jc w:val="center"/>
+                  </w:pPr>
+                  <w:r>
+                    <w:t xml:space="preserve">0.007</w:t>
+                  </w:r>
+                </w:p>
+              </w:tc>
+              <w:tc>
+                <w:tcPr/>
+                <w:p>
+                  <w:pPr>
+                    <w:pStyle w:val="Compact"/>
+                    <w:jc w:val="right"/>
+                    <w:jc w:val="center"/>
+                  </w:pPr>
+                  <w:r>
+                    <w:t xml:space="preserve">0.51</w:t>
+                  </w:r>
+                </w:p>
+              </w:tc>
+            </w:tr>
+            <w:tr>
+              <w:tc>
+                <w:tcPr/>
+                <w:p>
+                  <w:pPr>
+                    <w:pStyle w:val="Compact"/>
+                    <w:jc w:val="left"/>
+                    <w:jc w:val="center"/>
+                  </w:pPr>
+                  <w:r>
+                    <w:t xml:space="preserve">Malawi</w:t>
+                  </w:r>
+                </w:p>
+              </w:tc>
+              <w:tc>
+                <w:tcPr/>
+                <w:p>
+                  <w:pPr>
+                    <w:pStyle w:val="Compact"/>
+                    <w:jc w:val="left"/>
+                    <w:jc w:val="center"/>
+                  </w:pPr>
+                  <w:r>
+                    <w:t xml:space="preserve">child_vitA</w:t>
+                  </w:r>
+                </w:p>
+              </w:tc>
+              <w:tc>
+                <w:tcPr/>
+                <w:p>
+                  <w:pPr>
+                    <w:pStyle w:val="Compact"/>
+                    <w:jc w:val="left"/>
+                    <w:jc w:val="center"/>
+                  </w:pPr>
+                  <w:r>
+                    <w:t xml:space="preserve">district</w:t>
+                  </w:r>
+                </w:p>
+              </w:tc>
+              <w:tc>
+                <w:tcPr/>
+                <w:p>
+                  <w:pPr>
+                    <w:pStyle w:val="Compact"/>
+                    <w:jc w:val="right"/>
+                    <w:jc w:val="center"/>
+                  </w:pPr>
+                  <w:r>
+                    <w:t xml:space="preserve">86</w:t>
+                  </w:r>
+                </w:p>
+              </w:tc>
+              <w:tc>
+                <w:tcPr/>
+                <w:p>
+                  <w:pPr>
+                    <w:pStyle w:val="Compact"/>
+                    <w:jc w:val="right"/>
+                    <w:jc w:val="center"/>
+                  </w:pPr>
+                  <w:r>
+                    <w:t xml:space="preserve">0.04</w:t>
+                  </w:r>
+                </w:p>
+              </w:tc>
+              <w:tc>
+                <w:tcPr/>
+                <w:p>
+                  <w:pPr>
+                    <w:pStyle w:val="Compact"/>
+                    <w:jc w:val="left"/>
+                    <w:jc w:val="center"/>
+                  </w:pPr>
+                  <w:r>
+                    <w:t xml:space="preserve">[-0.13, 0.32]</w:t>
+                  </w:r>
+                </w:p>
+              </w:tc>
+              <w:tc>
+                <w:tcPr/>
+                <w:p>
+                  <w:pPr>
+                    <w:pStyle w:val="Compact"/>
+                    <w:jc w:val="right"/>
+                    <w:jc w:val="center"/>
+                  </w:pPr>
+                  <w:r>
+                    <w:t xml:space="preserve">0.306</w:t>
+                  </w:r>
+                </w:p>
+              </w:tc>
+              <w:tc>
+                <w:tcPr/>
+                <w:p>
+                  <w:pPr>
+                    <w:pStyle w:val="Compact"/>
+                    <w:jc w:val="right"/>
+                    <w:jc w:val="center"/>
+                  </w:pPr>
+                  <w:r>
+                    <w:t xml:space="preserve">0.11</w:t>
+                  </w:r>
+                </w:p>
+              </w:tc>
+            </w:tr>
+            <w:tr>
+              <w:tc>
+                <w:tcPr/>
+                <w:p>
+                  <w:pPr>
+                    <w:pStyle w:val="Compact"/>
+                    <w:jc w:val="left"/>
+                    <w:jc w:val="center"/>
+                  </w:pPr>
+                  <w:r>
+                    <w:t xml:space="preserve">Malawi</w:t>
+                  </w:r>
+                </w:p>
+              </w:tc>
+              <w:tc>
+                <w:tcPr/>
+                <w:p>
+                  <w:pPr>
+                    <w:pStyle w:val="Compact"/>
+                    <w:jc w:val="left"/>
+                    <w:jc w:val="center"/>
+                  </w:pPr>
+                  <w:r>
+                    <w:t xml:space="preserve">child_zinc</w:t>
+                  </w:r>
+                </w:p>
+              </w:tc>
+              <w:tc>
+                <w:tcPr/>
+                <w:p>
+                  <w:pPr>
+                    <w:pStyle w:val="Compact"/>
+                    <w:jc w:val="left"/>
+                    <w:jc w:val="center"/>
+                  </w:pPr>
+                  <w:r>
+                    <w:t xml:space="preserve">district</w:t>
+                  </w:r>
+                </w:p>
+              </w:tc>
+              <w:tc>
+                <w:tcPr/>
+                <w:p>
+                  <w:pPr>
+                    <w:pStyle w:val="Compact"/>
+                    <w:jc w:val="right"/>
+                    <w:jc w:val="center"/>
+                  </w:pPr>
+                  <w:r>
+                    <w:t xml:space="preserve">86</w:t>
+                  </w:r>
+                </w:p>
+              </w:tc>
+              <w:tc>
+                <w:tcPr/>
+                <w:p>
+                  <w:pPr>
+                    <w:pStyle w:val="Compact"/>
+                    <w:jc w:val="right"/>
+                    <w:jc w:val="center"/>
+                  </w:pPr>
+                  <w:r>
+                    <w:t xml:space="preserve">-0.25</w:t>
+                  </w:r>
+                </w:p>
+              </w:tc>
+              <w:tc>
+                <w:tcPr/>
+                <w:p>
+                  <w:pPr>
+                    <w:pStyle w:val="Compact"/>
+                    <w:jc w:val="left"/>
+                    <w:jc w:val="center"/>
+                  </w:pPr>
+                  <w:r>
+                    <w:t xml:space="preserve">[-0.42, -0.05]</w:t>
+                  </w:r>
+                </w:p>
+              </w:tc>
+              <w:tc>
+                <w:tcPr/>
+                <w:p>
+                  <w:pPr>
+                    <w:pStyle w:val="Compact"/>
+                    <w:jc w:val="right"/>
+                    <w:jc w:val="center"/>
+                  </w:pPr>
+                  <w:r>
+                    <w:t xml:space="preserve">0.992</w:t>
+                  </w:r>
+                </w:p>
+              </w:tc>
+              <w:tc>
+                <w:tcPr/>
+                <w:p>
+                  <w:pPr>
+                    <w:pStyle w:val="Compact"/>
+                    <w:jc w:val="right"/>
+                    <w:jc w:val="center"/>
+                  </w:pPr>
+                  <w:r>
+                    <w:t xml:space="preserve">-0.80</w:t>
+                  </w:r>
+                </w:p>
+              </w:tc>
+            </w:tr>
+            <w:tr>
+              <w:tc>
+                <w:tcPr/>
+                <w:p>
+                  <w:pPr>
+                    <w:pStyle w:val="Compact"/>
+                    <w:jc w:val="left"/>
+                    <w:jc w:val="center"/>
+                  </w:pPr>
+                  <w:r>
+                    <w:t xml:space="preserve">Malawi</w:t>
+                  </w:r>
+                </w:p>
+              </w:tc>
+              <w:tc>
+                <w:tcPr/>
+                <w:p>
+                  <w:pPr>
+                    <w:pStyle w:val="Compact"/>
+                    <w:jc w:val="left"/>
+                    <w:jc w:val="center"/>
+                  </w:pPr>
+                  <w:r>
+                    <w:t xml:space="preserve">women_b12</w:t>
+                  </w:r>
+                </w:p>
+              </w:tc>
+              <w:tc>
+                <w:tcPr/>
+                <w:p>
+                  <w:pPr>
+                    <w:pStyle w:val="Compact"/>
+                    <w:jc w:val="left"/>
+                    <w:jc w:val="center"/>
+                  </w:pPr>
+                  <w:r>
+                    <w:t xml:space="preserve">district</w:t>
+                  </w:r>
+                </w:p>
+              </w:tc>
+              <w:tc>
+                <w:tcPr/>
+                <w:p>
+                  <w:pPr>
+                    <w:pStyle w:val="Compact"/>
+                    <w:jc w:val="right"/>
+                    <w:jc w:val="center"/>
+                  </w:pPr>
+                  <w:r>
+                    <w:t xml:space="preserve">83</w:t>
+                  </w:r>
+                </w:p>
+              </w:tc>
+              <w:tc>
+                <w:tcPr/>
+                <w:p>
+                  <w:pPr>
+                    <w:pStyle w:val="Compact"/>
+                    <w:jc w:val="right"/>
+                    <w:jc w:val="center"/>
+                  </w:pPr>
+                  <w:r>
+                    <w:t xml:space="preserve">0.21</w:t>
+                  </w:r>
+                </w:p>
+              </w:tc>
+              <w:tc>
+                <w:tcPr/>
+                <w:p>
+                  <w:pPr>
+                    <w:pStyle w:val="Compact"/>
+                    <w:jc w:val="left"/>
+                    <w:jc w:val="center"/>
+                  </w:pPr>
+                  <w:r>
+                    <w:t xml:space="preserve">[0.04, 0.43]</w:t>
+                  </w:r>
+                </w:p>
+              </w:tc>
+              <w:tc>
+                <w:tcPr/>
+                <w:p>
+                  <w:pPr>
+                    <w:pStyle w:val="Compact"/>
+                    <w:jc w:val="right"/>
+                    <w:jc w:val="center"/>
+                  </w:pPr>
+                  <w:r>
+                    <w:t xml:space="preserve">0.035</w:t>
+                  </w:r>
+                </w:p>
+              </w:tc>
+              <w:tc>
+                <w:tcPr/>
+                <w:p>
+                  <w:pPr>
+                    <w:pStyle w:val="Compact"/>
+                    <w:jc w:val="right"/>
+                    <w:jc w:val="center"/>
+                  </w:pPr>
+                  <w:r>
+                    <w:t xml:space="preserve">0.53</w:t>
+                  </w:r>
+                </w:p>
+              </w:tc>
+            </w:tr>
+            <w:tr>
+              <w:tc>
+                <w:tcPr/>
+                <w:p>
+                  <w:pPr>
+                    <w:pStyle w:val="Compact"/>
+                    <w:jc w:val="left"/>
+                    <w:jc w:val="center"/>
+                  </w:pPr>
+                  <w:r>
+                    <w:t xml:space="preserve">Malawi</w:t>
+                  </w:r>
+                </w:p>
+              </w:tc>
+              <w:tc>
+                <w:tcPr/>
+                <w:p>
+                  <w:pPr>
+                    <w:pStyle w:val="Compact"/>
+                    <w:jc w:val="left"/>
+                    <w:jc w:val="center"/>
+                  </w:pPr>
+                  <w:r>
+                    <w:t xml:space="preserve">women_folate</w:t>
+                  </w:r>
+                </w:p>
+              </w:tc>
+              <w:tc>
+                <w:tcPr/>
+                <w:p>
+                  <w:pPr>
+                    <w:pStyle w:val="Compact"/>
+                    <w:jc w:val="left"/>
+                    <w:jc w:val="center"/>
+                  </w:pPr>
+                  <w:r>
+                    <w:t xml:space="preserve">district</w:t>
+                  </w:r>
+                </w:p>
+              </w:tc>
+              <w:tc>
+                <w:tcPr/>
+                <w:p>
+                  <w:pPr>
+                    <w:pStyle w:val="Compact"/>
+                    <w:jc w:val="right"/>
+                    <w:jc w:val="center"/>
+                  </w:pPr>
+                  <w:r>
+                    <w:t xml:space="preserve">83</w:t>
+                  </w:r>
+                </w:p>
+              </w:tc>
+              <w:tc>
+                <w:tcPr/>
+                <w:p>
+                  <w:pPr>
+                    <w:pStyle w:val="Compact"/>
+                    <w:jc w:val="right"/>
+                    <w:jc w:val="center"/>
+                  </w:pPr>
+                  <w:r>
+                    <w:t xml:space="preserve">0.37</w:t>
+                  </w:r>
+                </w:p>
+              </w:tc>
+              <w:tc>
+                <w:tcPr/>
+                <w:p>
+                  <w:pPr>
+                    <w:pStyle w:val="Compact"/>
+                    <w:jc w:val="left"/>
+                    <w:jc w:val="center"/>
+                  </w:pPr>
+                  <w:r>
+                    <w:t xml:space="preserve">[0.15, 0.54]</w:t>
+                  </w:r>
+                </w:p>
+              </w:tc>
+              <w:tc>
+                <w:tcPr/>
+                <w:p>
+                  <w:pPr>
+                    <w:pStyle w:val="Compact"/>
+                    <w:jc w:val="right"/>
+                    <w:jc w:val="center"/>
+                  </w:pPr>
+                  <w:r>
+                    <w:t xml:space="preserve">0.002</w:t>
+                  </w:r>
+                </w:p>
+              </w:tc>
+              <w:tc>
+                <w:tcPr/>
+                <w:p>
+                  <w:pPr>
+                    <w:pStyle w:val="Compact"/>
+                    <w:jc w:val="right"/>
+                    <w:jc w:val="center"/>
+                  </w:pPr>
+                  <w:r>
+                    <w:t xml:space="preserve">0.67</w:t>
+                  </w:r>
+                </w:p>
+              </w:tc>
+            </w:tr>
+            <w:tr>
+              <w:tc>
+                <w:tcPr/>
+                <w:p>
+                  <w:pPr>
+                    <w:pStyle w:val="Compact"/>
+                    <w:jc w:val="left"/>
+                    <w:jc w:val="center"/>
+                  </w:pPr>
+                  <w:r>
+                    <w:t xml:space="preserve">Malawi</w:t>
+                  </w:r>
+                </w:p>
+              </w:tc>
+              <w:tc>
+                <w:tcPr/>
+                <w:p>
+                  <w:pPr>
+                    <w:pStyle w:val="Compact"/>
+                    <w:jc w:val="left"/>
+                    <w:jc w:val="center"/>
+                  </w:pPr>
+                  <w:r>
+                    <w:t xml:space="preserve">women_iron</w:t>
+                  </w:r>
+                </w:p>
+              </w:tc>
+              <w:tc>
+                <w:tcPr/>
+                <w:p>
+                  <w:pPr>
+                    <w:pStyle w:val="Compact"/>
+                    <w:jc w:val="left"/>
+                    <w:jc w:val="center"/>
+                  </w:pPr>
+                  <w:r>
+                    <w:t xml:space="preserve">district</w:t>
+                  </w:r>
+                </w:p>
+              </w:tc>
+              <w:tc>
+                <w:tcPr/>
+                <w:p>
+                  <w:pPr>
+                    <w:pStyle w:val="Compact"/>
+                    <w:jc w:val="right"/>
+                    <w:jc w:val="center"/>
+                  </w:pPr>
+                  <w:r>
+                    <w:t xml:space="preserve">78</w:t>
+                  </w:r>
+                </w:p>
+              </w:tc>
+              <w:tc>
+                <w:tcPr/>
+                <w:p>
+                  <w:pPr>
+                    <w:pStyle w:val="Compact"/>
+                    <w:jc w:val="right"/>
+                    <w:jc w:val="center"/>
+                  </w:pPr>
+                  <w:r>
+                    <w:t xml:space="preserve">0.02</w:t>
+                  </w:r>
+                </w:p>
+              </w:tc>
+              <w:tc>
+                <w:tcPr/>
+                <w:p>
+                  <w:pPr>
+                    <w:pStyle w:val="Compact"/>
+                    <w:jc w:val="left"/>
+                    <w:jc w:val="center"/>
+                  </w:pPr>
+                  <w:r>
+                    <w:t xml:space="preserve">[-0.14, 0.22]</w:t>
+                  </w:r>
+                </w:p>
+              </w:tc>
+              <w:tc>
+                <w:tcPr/>
+                <w:p>
+                  <w:pPr>
+                    <w:pStyle w:val="Compact"/>
+                    <w:jc w:val="right"/>
+                    <w:jc w:val="center"/>
+                  </w:pPr>
+                  <w:r>
+                    <w:t xml:space="preserve">0.431</w:t>
+                  </w:r>
+                </w:p>
+              </w:tc>
+              <w:tc>
+                <w:tcPr/>
+                <w:p>
+                  <w:pPr>
+                    <w:pStyle w:val="Compact"/>
+                    <w:jc w:val="right"/>
+                    <w:jc w:val="center"/>
+                  </w:pPr>
+                  <w:r>
+                    <w:t xml:space="preserve">0.04</w:t>
+                  </w:r>
+                </w:p>
+              </w:tc>
+            </w:tr>
+            <w:tr>
+              <w:tc>
+                <w:tcPr/>
+                <w:p>
+                  <w:pPr>
+                    <w:pStyle w:val="Compact"/>
+                    <w:jc w:val="left"/>
+                    <w:jc w:val="center"/>
+                  </w:pPr>
+                  <w:r>
+                    <w:t xml:space="preserve">Malawi</w:t>
+                  </w:r>
+                </w:p>
+              </w:tc>
+              <w:tc>
+                <w:tcPr/>
+                <w:p>
+                  <w:pPr>
+                    <w:pStyle w:val="Compact"/>
+                    <w:jc w:val="left"/>
+                    <w:jc w:val="center"/>
+                  </w:pPr>
+                  <w:r>
+                    <w:t xml:space="preserve">women_vitA</w:t>
+                  </w:r>
+                </w:p>
+              </w:tc>
+              <w:tc>
+                <w:tcPr/>
+                <w:p>
+                  <w:pPr>
+                    <w:pStyle w:val="Compact"/>
+                    <w:jc w:val="left"/>
+                    <w:jc w:val="center"/>
+                  </w:pPr>
+                  <w:r>
+                    <w:t xml:space="preserve">district</w:t>
+                  </w:r>
+                </w:p>
+              </w:tc>
+              <w:tc>
+                <w:tcPr/>
+                <w:p>
+                  <w:pPr>
+                    <w:pStyle w:val="Compact"/>
+                    <w:jc w:val="right"/>
+                    <w:jc w:val="center"/>
+                  </w:pPr>
+                  <w:r>
+                    <w:t xml:space="preserve">82</w:t>
+                  </w:r>
+                </w:p>
+              </w:tc>
+              <w:tc>
+                <w:tcPr/>
+                <w:p>
+                  <w:pPr>
+                    <w:pStyle w:val="Compact"/>
+                    <w:jc w:val="right"/>
+                    <w:jc w:val="center"/>
+                  </w:pPr>
+                  <w:r>
+                    <w:t xml:space="preserve">0.06</w:t>
+                  </w:r>
+                </w:p>
+              </w:tc>
+              <w:tc>
+                <w:tcPr/>
+                <w:p>
+                  <w:pPr>
+                    <w:pStyle w:val="Compact"/>
+                    <w:jc w:val="left"/>
+                    <w:jc w:val="center"/>
+                  </w:pPr>
+                  <w:r>
+                    <w:t xml:space="preserve">[-0.10, 0.24]</w:t>
+                  </w:r>
+                </w:p>
+              </w:tc>
+              <w:tc>
+                <w:tcPr/>
+                <w:p>
+                  <w:pPr>
+                    <w:pStyle w:val="Compact"/>
+                    <w:jc w:val="right"/>
+                    <w:jc w:val="center"/>
+                  </w:pPr>
+                  <w:r>
+                    <w:t xml:space="preserve">0.282</w:t>
+                  </w:r>
+                </w:p>
+              </w:tc>
+              <w:tc>
+                <w:tcPr/>
+                <w:p>
+                  <w:pPr>
+                    <w:pStyle w:val="Compact"/>
+                    <w:jc w:val="right"/>
+                    <w:jc w:val="center"/>
+                  </w:pPr>
+                  <w:r>
+                    <w:t xml:space="preserve">0.18</w:t>
+                  </w:r>
+                </w:p>
+              </w:tc>
+            </w:tr>
+            <w:tr>
+              <w:tc>
+                <w:tcPr/>
+                <w:p>
+                  <w:pPr>
+                    <w:pStyle w:val="Compact"/>
+                    <w:jc w:val="left"/>
+                    <w:jc w:val="center"/>
+                  </w:pPr>
+                  <w:r>
+                    <w:t xml:space="preserve">Malawi</w:t>
+                  </w:r>
+                </w:p>
+              </w:tc>
+              <w:tc>
+                <w:tcPr/>
+                <w:p>
+                  <w:pPr>
+                    <w:pStyle w:val="Compact"/>
+                    <w:jc w:val="left"/>
+                    <w:jc w:val="center"/>
+                  </w:pPr>
+                  <w:r>
+                    <w:t xml:space="preserve">women_zinc</w:t>
+                  </w:r>
+                </w:p>
+              </w:tc>
+              <w:tc>
+                <w:tcPr/>
+                <w:p>
+                  <w:pPr>
+                    <w:pStyle w:val="Compact"/>
+                    <w:jc w:val="left"/>
+                    <w:jc w:val="center"/>
+                  </w:pPr>
+                  <w:r>
+                    <w:t xml:space="preserve">district</w:t>
+                  </w:r>
+                </w:p>
+              </w:tc>
+              <w:tc>
+                <w:tcPr/>
+                <w:p>
+                  <w:pPr>
+                    <w:pStyle w:val="Compact"/>
+                    <w:jc w:val="right"/>
+                    <w:jc w:val="center"/>
+                  </w:pPr>
+                  <w:r>
+                    <w:t xml:space="preserve">82</w:t>
+                  </w:r>
+                </w:p>
+              </w:tc>
+              <w:tc>
+                <w:tcPr/>
+                <w:p>
+                  <w:pPr>
+                    <w:pStyle w:val="Compact"/>
+                    <w:jc w:val="right"/>
+                    <w:jc w:val="center"/>
+                  </w:pPr>
+                  <w:r>
+                    <w:t xml:space="preserve">-0.18</w:t>
+                  </w:r>
+                </w:p>
+              </w:tc>
+              <w:tc>
+                <w:tcPr/>
+                <w:p>
+                  <w:pPr>
+                    <w:pStyle w:val="Compact"/>
+                    <w:jc w:val="left"/>
+                    <w:jc w:val="center"/>
+                  </w:pPr>
+                  <w:r>
+                    <w:t xml:space="preserve">[-0.39, 0.02]</w:t>
+                  </w:r>
+                </w:p>
+              </w:tc>
+              <w:tc>
+                <w:tcPr/>
+                <w:p>
+                  <w:pPr>
+                    <w:pStyle w:val="Compact"/>
+                    <w:jc w:val="right"/>
+                    <w:jc w:val="center"/>
+                  </w:pPr>
+                  <w:r>
+                    <w:t xml:space="preserve">0.947</w:t>
+                  </w:r>
+                </w:p>
+              </w:tc>
+              <w:tc>
+                <w:tcPr/>
+                <w:p>
+                  <w:pPr>
+                    <w:pStyle w:val="Compact"/>
+                    <w:jc w:val="right"/>
+                    <w:jc w:val="center"/>
+                  </w:pPr>
+                  <w:r>
+                    <w:t xml:space="preserve">-0.56</w:t>
+                  </w:r>
+                </w:p>
+              </w:tc>
+            </w:tr>
+            <w:tr>
+              <w:tc>
+                <w:tcPr/>
+                <w:p>
+                  <w:pPr>
+                    <w:pStyle w:val="Compact"/>
+                    <w:jc w:val="left"/>
+                    <w:jc w:val="center"/>
+                  </w:pPr>
+                  <w:r>
+                    <w:t xml:space="preserve">Sierra Leone</w:t>
+                  </w:r>
+                </w:p>
+              </w:tc>
+              <w:tc>
+                <w:tcPr/>
+                <w:p>
+                  <w:pPr>
+                    <w:pStyle w:val="Compact"/>
+                    <w:jc w:val="left"/>
+                    <w:jc w:val="center"/>
+                  </w:pPr>
+                  <w:r>
+                    <w:t xml:space="preserve">child_iron</w:t>
+                  </w:r>
+                </w:p>
+              </w:tc>
+              <w:tc>
+                <w:tcPr/>
+                <w:p>
+                  <w:pPr>
+                    <w:pStyle w:val="Compact"/>
+                    <w:jc w:val="left"/>
+                    <w:jc w:val="center"/>
+                  </w:pPr>
+                  <w:r>
+                    <w:t xml:space="preserve">district</w:t>
+                  </w:r>
+                </w:p>
+              </w:tc>
+              <w:tc>
+                <w:tcPr/>
+                <w:p>
+                  <w:pPr>
+                    <w:pStyle w:val="Compact"/>
+                    <w:jc w:val="right"/>
+                    <w:jc w:val="center"/>
+                  </w:pPr>
+                  <w:r>
+                    <w:t xml:space="preserve">14</w:t>
+                  </w:r>
+                </w:p>
+              </w:tc>
+              <w:tc>
+                <w:tcPr/>
+                <w:p>
+                  <w:pPr>
+                    <w:pStyle w:val="Compact"/>
+                    <w:jc w:val="right"/>
+                    <w:jc w:val="center"/>
+                  </w:pPr>
+                  <w:r>
+                    <w:t xml:space="preserve">-0.12</w:t>
+                  </w:r>
+                </w:p>
+              </w:tc>
+              <w:tc>
+                <w:tcPr/>
+                <w:p>
+                  <w:pPr>
+                    <w:pStyle w:val="Compact"/>
+                    <w:jc w:val="left"/>
+                    <w:jc w:val="center"/>
+                  </w:pPr>
+                  <w:r>
+                    <w:t xml:space="preserve">[-0.66, 0.45]</w:t>
+                  </w:r>
+                </w:p>
+              </w:tc>
+              <w:tc>
+                <w:tcPr/>
+                <w:p>
+                  <w:pPr>
+                    <w:pStyle w:val="Compact"/>
+                    <w:jc w:val="right"/>
+                    <w:jc w:val="center"/>
+                  </w:pPr>
+                  <w:r>
+                    <w:t xml:space="preserve">0.658</w:t>
+                  </w:r>
+                </w:p>
+              </w:tc>
+              <w:tc>
+                <w:tcPr/>
+                <w:p>
+                  <w:pPr>
+                    <w:pStyle w:val="Compact"/>
+                    <w:jc w:val="right"/>
+                    <w:jc w:val="center"/>
+                  </w:pPr>
+                  <w:r>
+                    <w:t xml:space="preserve">-0.25</w:t>
+                  </w:r>
+                </w:p>
+              </w:tc>
+            </w:tr>
+            <w:tr>
+              <w:tc>
+                <w:tcPr/>
+                <w:p>
+                  <w:pPr>
+                    <w:pStyle w:val="Compact"/>
+                    <w:jc w:val="left"/>
+                    <w:jc w:val="center"/>
+                  </w:pPr>
+                  <w:r>
+                    <w:t xml:space="preserve">Sierra Leone</w:t>
+                  </w:r>
+                </w:p>
+              </w:tc>
+              <w:tc>
+                <w:tcPr/>
+                <w:p>
+                  <w:pPr>
+                    <w:pStyle w:val="Compact"/>
+                    <w:jc w:val="left"/>
+                    <w:jc w:val="center"/>
+                  </w:pPr>
+                  <w:r>
+                    <w:t xml:space="preserve">child_vitA</w:t>
+                  </w:r>
+                </w:p>
+              </w:tc>
+              <w:tc>
+                <w:tcPr/>
+                <w:p>
+                  <w:pPr>
+                    <w:pStyle w:val="Compact"/>
+                    <w:jc w:val="left"/>
+                    <w:jc w:val="center"/>
+                  </w:pPr>
+                  <w:r>
+                    <w:t xml:space="preserve">district</w:t>
+                  </w:r>
+                </w:p>
+              </w:tc>
+              <w:tc>
+                <w:tcPr/>
+                <w:p>
+                  <w:pPr>
+                    <w:pStyle w:val="Compact"/>
+                    <w:jc w:val="right"/>
+                    <w:jc w:val="center"/>
+                  </w:pPr>
+                  <w:r>
+                    <w:t xml:space="preserve">14</w:t>
+                  </w:r>
+                </w:p>
+              </w:tc>
+              <w:tc>
+                <w:tcPr/>
+                <w:p>
+                  <w:pPr>
+                    <w:pStyle w:val="Compact"/>
+                    <w:jc w:val="right"/>
+                    <w:jc w:val="center"/>
+                  </w:pPr>
+                  <w:r>
+                    <w:t xml:space="preserve">-0.22</w:t>
+                  </w:r>
+                </w:p>
+              </w:tc>
+              <w:tc>
+                <w:tcPr/>
+                <w:p>
+                  <w:pPr>
+                    <w:pStyle w:val="Compact"/>
+                    <w:jc w:val="left"/>
+                    <w:jc w:val="center"/>
+                  </w:pPr>
+                  <w:r>
+                    <w:t xml:space="preserve">[-0.73, 0.01]</w:t>
+                  </w:r>
+                </w:p>
+              </w:tc>
+              <w:tc>
+                <w:tcPr/>
+                <w:p>
+                  <w:pPr>
+                    <w:pStyle w:val="Compact"/>
+                    <w:jc w:val="right"/>
+                    <w:jc w:val="center"/>
+                  </w:pPr>
+                  <w:r>
+                    <w:t xml:space="preserve">0.816</w:t>
+                  </w:r>
+                </w:p>
+              </w:tc>
+              <w:tc>
+                <w:tcPr/>
+                <w:p>
+                  <w:pPr>
+                    <w:pStyle w:val="Compact"/>
+                    <w:jc w:val="right"/>
+                    <w:jc w:val="center"/>
+                  </w:pPr>
+                  <w:r>
+                    <w:t xml:space="preserve">-0.64</w:t>
+                  </w:r>
+                </w:p>
+              </w:tc>
+            </w:tr>
+            <w:tr>
+              <w:tc>
+                <w:tcPr/>
+                <w:p>
+                  <w:pPr>
+                    <w:pStyle w:val="Compact"/>
+                    <w:jc w:val="left"/>
+                    <w:jc w:val="center"/>
+                  </w:pPr>
+                  <w:r>
+                    <w:t xml:space="preserve">Sierra Leone</w:t>
+                  </w:r>
+                </w:p>
+              </w:tc>
+              <w:tc>
+                <w:tcPr/>
+                <w:p>
+                  <w:pPr>
+                    <w:pStyle w:val="Compact"/>
+                    <w:jc w:val="left"/>
+                    <w:jc w:val="center"/>
+                  </w:pPr>
+                  <w:r>
+                    <w:t xml:space="preserve">women_b12</w:t>
+                  </w:r>
+                </w:p>
+              </w:tc>
+              <w:tc>
+                <w:tcPr/>
+                <w:p>
+                  <w:pPr>
+                    <w:pStyle w:val="Compact"/>
+                    <w:jc w:val="left"/>
+                    <w:jc w:val="center"/>
+                  </w:pPr>
+                  <w:r>
+                    <w:t xml:space="preserve">district</w:t>
+                  </w:r>
+                </w:p>
+              </w:tc>
+              <w:tc>
+                <w:tcPr/>
+                <w:p>
+                  <w:pPr>
+                    <w:pStyle w:val="Compact"/>
+                    <w:jc w:val="right"/>
+                    <w:jc w:val="center"/>
+                  </w:pPr>
+                  <w:r>
+                    <w:t xml:space="preserve">14</w:t>
+                  </w:r>
+                </w:p>
+              </w:tc>
+              <w:tc>
+                <w:tcPr/>
+                <w:p>
+                  <w:pPr>
+                    <w:pStyle w:val="Compact"/>
+                    <w:jc w:val="right"/>
+                    <w:jc w:val="center"/>
+                  </w:pPr>
+                  <w:r>
+                    <w:t xml:space="preserve">0.35</w:t>
+                  </w:r>
+                </w:p>
+              </w:tc>
+              <w:tc>
+                <w:tcPr/>
+                <w:p>
+                  <w:pPr>
+                    <w:pStyle w:val="Compact"/>
+                    <w:jc w:val="left"/>
+                    <w:jc w:val="center"/>
+                  </w:pPr>
+                  <w:r>
+                    <w:t xml:space="preserve">[-0.48, 0.84]</w:t>
+                  </w:r>
+                </w:p>
+              </w:tc>
+              <w:tc>
+                <w:tcPr/>
+                <w:p>
+                  <w:pPr>
+                    <w:pStyle w:val="Compact"/>
+                    <w:jc w:val="right"/>
+                    <w:jc w:val="center"/>
+                  </w:pPr>
+                  <w:r>
+                    <w:t xml:space="preserve">0.245</w:t>
+                  </w:r>
+                </w:p>
+              </w:tc>
+              <w:tc>
+                <w:tcPr/>
+                <w:p>
+                  <w:pPr>
+                    <w:pStyle w:val="Compact"/>
+                    <w:jc w:val="right"/>
+                    <w:jc w:val="center"/>
+                  </w:pPr>
+                  <w:r>
+                    <w:t xml:space="preserve">0.01</w:t>
+                  </w:r>
+                </w:p>
+              </w:tc>
+            </w:tr>
+            <w:tr>
+              <w:tc>
+                <w:tcPr/>
+                <w:p>
+                  <w:pPr>
+                    <w:pStyle w:val="Compact"/>
+                    <w:jc w:val="left"/>
+                    <w:jc w:val="center"/>
+                  </w:pPr>
+                  <w:r>
+                    <w:t xml:space="preserve">Sierra Leone</w:t>
+                  </w:r>
+                </w:p>
+              </w:tc>
+              <w:tc>
+                <w:tcPr/>
+                <w:p>
+                  <w:pPr>
+                    <w:pStyle w:val="Compact"/>
+                    <w:jc w:val="left"/>
+                    <w:jc w:val="center"/>
+                  </w:pPr>
+                  <w:r>
+                    <w:t xml:space="preserve">women_folate</w:t>
+                  </w:r>
+                </w:p>
+              </w:tc>
+              <w:tc>
+                <w:tcPr/>
+                <w:p>
+                  <w:pPr>
+                    <w:pStyle w:val="Compact"/>
+                    <w:jc w:val="left"/>
+                    <w:jc w:val="center"/>
+                  </w:pPr>
+                  <w:r>
+                    <w:t xml:space="preserve">district</w:t>
+                  </w:r>
+                </w:p>
+              </w:tc>
+              <w:tc>
+                <w:tcPr/>
+                <w:p>
+                  <w:pPr>
+                    <w:pStyle w:val="Compact"/>
+                    <w:jc w:val="right"/>
+                    <w:jc w:val="center"/>
+                  </w:pPr>
+                  <w:r>
+                    <w:t xml:space="preserve">14</w:t>
+                  </w:r>
+                </w:p>
+              </w:tc>
+              <w:tc>
+                <w:tcPr/>
+                <w:p>
+                  <w:pPr>
+                    <w:pStyle w:val="Compact"/>
+                    <w:jc w:val="right"/>
+                    <w:jc w:val="center"/>
+                  </w:pPr>
+                  <w:r>
+                    <w:t xml:space="preserve">-0.72</w:t>
+                  </w:r>
+                </w:p>
+              </w:tc>
+              <w:tc>
+                <w:tcPr/>
+                <w:p>
+                  <w:pPr>
+                    <w:pStyle w:val="Compact"/>
+                    <w:jc w:val="left"/>
+                    <w:jc w:val="center"/>
+                  </w:pPr>
+                  <w:r>
+                    <w:t xml:space="preserve">[-0.89, -0.42]</w:t>
+                  </w:r>
+                </w:p>
+              </w:tc>
+              <w:tc>
+                <w:tcPr/>
+                <w:p>
+                  <w:pPr>
+                    <w:pStyle w:val="Compact"/>
+                    <w:jc w:val="right"/>
+                    <w:jc w:val="center"/>
+                  </w:pPr>
+                  <w:r>
+                    <w:t xml:space="preserve">1.000</w:t>
+                  </w:r>
+                </w:p>
+              </w:tc>
+              <w:tc>
+                <w:tcPr/>
+                <w:p>
+                  <w:pPr>
+                    <w:pStyle w:val="Compact"/>
+                    <w:jc w:val="right"/>
+                    <w:jc w:val="center"/>
+                  </w:pPr>
+                  <w:r>
+                    <w:t xml:space="preserve">-2.32</w:t>
+                  </w:r>
+                </w:p>
+              </w:tc>
+            </w:tr>
+            <w:tr>
+              <w:tc>
+                <w:tcPr/>
+                <w:p>
+                  <w:pPr>
+                    <w:pStyle w:val="Compact"/>
+                    <w:jc w:val="left"/>
+                    <w:jc w:val="center"/>
+                  </w:pPr>
+                  <w:r>
+                    <w:t xml:space="preserve">Sierra Leone</w:t>
+                  </w:r>
+                </w:p>
+              </w:tc>
+              <w:tc>
+                <w:tcPr/>
+                <w:p>
+                  <w:pPr>
+                    <w:pStyle w:val="Compact"/>
+                    <w:jc w:val="left"/>
+                    <w:jc w:val="center"/>
+                  </w:pPr>
+                  <w:r>
+                    <w:t xml:space="preserve">women_iron</w:t>
+                  </w:r>
+                </w:p>
+              </w:tc>
+              <w:tc>
+                <w:tcPr/>
+                <w:p>
+                  <w:pPr>
+                    <w:pStyle w:val="Compact"/>
+                    <w:jc w:val="left"/>
+                    <w:jc w:val="center"/>
+                  </w:pPr>
+                  <w:r>
+                    <w:t xml:space="preserve">district</w:t>
+                  </w:r>
+                </w:p>
+              </w:tc>
+              <w:tc>
+                <w:tcPr/>
+                <w:p>
+                  <w:pPr>
+                    <w:pStyle w:val="Compact"/>
+                    <w:jc w:val="right"/>
+                    <w:jc w:val="center"/>
+                  </w:pPr>
+                  <w:r>
+                    <w:t xml:space="preserve">14</w:t>
+                  </w:r>
+                </w:p>
+              </w:tc>
+              <w:tc>
+                <w:tcPr/>
+                <w:p>
+                  <w:pPr>
+                    <w:pStyle w:val="Compact"/>
+                    <w:jc w:val="right"/>
+                    <w:jc w:val="center"/>
+                  </w:pPr>
+                  <w:r>
+                    <w:t xml:space="preserve">0.05</w:t>
+                  </w:r>
+                </w:p>
+              </w:tc>
+              <w:tc>
+                <w:tcPr/>
+                <w:p>
+                  <w:pPr>
+                    <w:pStyle w:val="Compact"/>
+                    <w:jc w:val="left"/>
+                    <w:jc w:val="center"/>
+                  </w:pPr>
+                  <w:r>
+                    <w:t xml:space="preserve">[-0.35, 0.48]</w:t>
+                  </w:r>
+                </w:p>
+              </w:tc>
+              <w:tc>
+                <w:tcPr/>
+                <w:p>
+                  <w:pPr>
+                    <w:pStyle w:val="Compact"/>
+                    <w:jc w:val="right"/>
+                    <w:jc w:val="center"/>
+                  </w:pPr>
+                  <w:r>
+                    <w:t xml:space="preserve">0.447</w:t>
+                  </w:r>
+                </w:p>
+              </w:tc>
+              <w:tc>
+                <w:tcPr/>
+                <w:p>
+                  <w:pPr>
+                    <w:pStyle w:val="Compact"/>
+                    <w:jc w:val="right"/>
+                    <w:jc w:val="center"/>
+                  </w:pPr>
+                  <w:r>
+                    <w:t xml:space="preserve">0.08</w:t>
+                  </w:r>
+                </w:p>
+              </w:tc>
+            </w:tr>
+            <w:tr>
+              <w:tc>
+                <w:tcPr/>
+                <w:p>
+                  <w:pPr>
+                    <w:pStyle w:val="Compact"/>
+                    <w:jc w:val="left"/>
+                    <w:jc w:val="center"/>
+                  </w:pPr>
+                  <w:r>
+                    <w:t xml:space="preserve">Sierra Leone</w:t>
+                  </w:r>
+                </w:p>
+              </w:tc>
+              <w:tc>
+                <w:tcPr/>
+                <w:p>
+                  <w:pPr>
+                    <w:pStyle w:val="Compact"/>
+                    <w:jc w:val="left"/>
+                    <w:jc w:val="center"/>
+                  </w:pPr>
+                  <w:r>
+                    <w:t xml:space="preserve">women_vitA</w:t>
+                  </w:r>
+                </w:p>
+              </w:tc>
+              <w:tc>
+                <w:tcPr/>
+                <w:p>
+                  <w:pPr>
+                    <w:pStyle w:val="Compact"/>
+                    <w:jc w:val="left"/>
+                    <w:jc w:val="center"/>
+                  </w:pPr>
+                  <w:r>
+                    <w:t xml:space="preserve">district</w:t>
+                  </w:r>
+                </w:p>
+              </w:tc>
+              <w:tc>
+                <w:tcPr/>
+                <w:p>
+                  <w:pPr>
+                    <w:pStyle w:val="Compact"/>
+                    <w:jc w:val="right"/>
+                    <w:jc w:val="center"/>
+                  </w:pPr>
+                  <w:r>
+                    <w:t xml:space="preserve">14</w:t>
+                  </w:r>
+                </w:p>
+              </w:tc>
+              <w:tc>
+                <w:tcPr/>
+                <w:p>
+                  <w:pPr>
+                    <w:pStyle w:val="Compact"/>
+                    <w:jc w:val="right"/>
+                    <w:jc w:val="center"/>
+                  </w:pPr>
+                  <w:r>
+                    <w:t xml:space="preserve">-0.26</w:t>
+                  </w:r>
+                </w:p>
+              </w:tc>
+              <w:tc>
+                <w:tcPr/>
+                <w:p>
+                  <w:pPr>
+                    <w:pStyle w:val="Compact"/>
+                    <w:jc w:val="left"/>
+                    <w:jc w:val="center"/>
+                  </w:pPr>
+                  <w:r>
+                    <w:t xml:space="preserve">[-0.94, 0.30]</w:t>
+                  </w:r>
+                </w:p>
+              </w:tc>
+              <w:tc>
+                <w:tcPr/>
+                <w:p>
+                  <w:pPr>
+                    <w:pStyle w:val="Compact"/>
+                    <w:jc w:val="right"/>
+                    <w:jc w:val="center"/>
+                  </w:pPr>
+                  <w:r>
+                    <w:t xml:space="preserve">0.837</w:t>
+                  </w:r>
+                </w:p>
+              </w:tc>
+              <w:tc>
+                <w:tcPr/>
+                <w:p>
+                  <w:pPr>
+                    <w:pStyle w:val="Compact"/>
+                    <w:jc w:val="right"/>
+                    <w:jc w:val="center"/>
+                  </w:pPr>
+                  <w:r>
+                    <w:t xml:space="preserve">-0.63</w:t>
+                  </w:r>
+                </w:p>
+              </w:tc>
+            </w:tr>
+          </w:tbl>
+          <w:bookmarkEnd w:id="32"/>
+          <w:p/>
+        </w:tc>
+      </w:tr>
+    </w:tbl>
+    <w:bookmarkEnd w:id="33"/>
+    <w:bookmarkStart w:id="44" w:name="cross-country-transportability"/>
+    <w:p>
+      <w:pPr>
+        <w:pStyle w:val="Heading2"/>
+      </w:pPr>
+      <w:r>
+        <w:t xml:space="preserve">3.5 Cross-country transportability</w:t>
+      </w:r>
+    </w:p>
+    <w:p>
+      <w:pPr>
+        <w:pStyle w:val="FirstParagraph"/>
+      </w:pPr>
+      <w:r>
+        <w:t xml:space="preserve">LOCO holdout produced markedly weaker performance than within-country</w:t>
+      </w:r>
+      <w:r>
+        <w:t xml:space="preserve"> </w:t>
+      </w:r>
+      <w:r>
+        <w:t xml:space="preserve">cross-validation (</w:t>
+      </w:r>
+      <w:hyperlink w:anchor="tbl-loco">
+        <w:r>
+          <w:rPr>
+            <w:rStyle w:val="Hyperlink"/>
+          </w:rPr>
+          <w:t xml:space="preserve">Table 4</w:t>
+        </w:r>
+      </w:hyperlink>
+      <w:r>
+        <w:t xml:space="preserve">;</w:t>
+      </w:r>
+      <w:r>
+        <w:t xml:space="preserve"> </w:t>
+      </w:r>
+      <w:hyperlink w:anchor="fig-loco-scatter">
+        <w:r>
+          <w:rPr>
+            <w:rStyle w:val="Hyperlink"/>
+          </w:rPr>
+          <w:t xml:space="preserve">Figure 1</w:t>
+        </w:r>
+      </w:hyperlink>
+      <w:r>
+        <w:t xml:space="preserve">). Across the 16</w:t>
+      </w:r>
+      <w:r>
+        <w:t xml:space="preserve"> </w:t>
+      </w:r>
+      <w:r>
+        <w:t xml:space="preserve">outcome–holdout combinations, Pearson r had a median of 0.29 and ranged</w:t>
+      </w:r>
+      <w:r>
+        <w:t xml:space="preserve"> </w:t>
+      </w:r>
+      <w:r>
+        <w:t xml:space="preserve">from −0.21 to 0.75, with iron deficiency outcomes transporting best (median r</w:t>
+      </w:r>
+      <w:r>
+        <w:t xml:space="preserve"> </w:t>
+      </w:r>
+      <w:r>
+        <w:t xml:space="preserve">0.35 in children, 0.22 in women) and vitamin-A outcomes weaker (median r</w:t>
+      </w:r>
+      <w:r>
+        <w:t xml:space="preserve"> </w:t>
+      </w:r>
+      <w:r>
+        <w:t xml:space="preserve">0.24 in children, 0.37 in women), with anti-predictive ordering in some</w:t>
+      </w:r>
+      <w:r>
+        <w:t xml:space="preserve"> </w:t>
+      </w:r>
+      <w:r>
+        <w:t xml:space="preserve">holdouts.</w:t>
+      </w:r>
+    </w:p>
+    <w:p>
+      <w:pPr>
+        <w:pStyle w:val="BodyText"/>
+      </w:pPr>
+      <w:r>
+        <w:t xml:space="preserve">The area-level recipe, applied with the universal (earth-observation-only)</w:t>
+      </w:r>
+      <w:r>
+        <w:t xml:space="preserve"> </w:t>
+      </w:r>
+      <w:r>
+        <w:t xml:space="preserve">feature set and scored by rank correlation, produced comparable point</w:t>
+      </w:r>
+      <w:r>
+        <w:t xml:space="preserve"> </w:t>
+      </w:r>
+      <w:r>
+        <w:t xml:space="preserve">estimates to within-country cross-validation (Spearman 0.42 and 0.49 for</w:t>
+      </w:r>
+      <w:r>
+        <w:t xml:space="preserve"> </w:t>
+      </w:r>
+      <w:r>
+        <w:t xml:space="preserve">child iron, 0.75 and 0.35 for women’s iron, in Gambia and Ghana respectively)</w:t>
+      </w:r>
+      <w:r>
+        <w:t xml:space="preserve"> </w:t>
+      </w:r>
+      <w:r>
+        <w:t xml:space="preserve">but not to Malawi (Spearman ≈ 0.03–0.05), and vitamin A did not transport</w:t>
+      </w:r>
+      <w:r>
+        <w:t xml:space="preserve"> </w:t>
+      </w:r>
+      <w:r>
+        <w:t xml:space="preserve">well in any country. As noted above (</w:t>
+      </w:r>
+      <w:hyperlink w:anchor="sec-recipe-audit">
+        <w:r>
+          <w:rPr>
+            <w:rStyle w:val="Hyperlink"/>
+          </w:rPr>
+          <w:t xml:space="preserve">Section 3.4</w:t>
+        </w:r>
+      </w:hyperlink>
+      <w:r>
+        <w:t xml:space="preserve">), the recipe’s</w:t>
+      </w:r>
+      <w:r>
+        <w:t xml:space="preserve"> </w:t>
+      </w:r>
+      <w:r>
+        <w:t xml:space="preserve">apparent edge over simpler comparators does not survive a leakage-corrected</w:t>
+      </w:r>
+      <w:r>
+        <w:t xml:space="preserve"> </w:t>
+      </w:r>
+      <w:r>
+        <w:t xml:space="preserve">re-ranking, so we read these numbers as descriptive of the recipe’s own</w:t>
+      </w:r>
+      <w:r>
+        <w:t xml:space="preserve"> </w:t>
+      </w:r>
+      <w:r>
+        <w:t xml:space="preserve">LOCO behaviour rather than as evidence that it out-transports the benchmark</w:t>
+      </w:r>
+      <w:r>
+        <w:t xml:space="preserve"> </w:t>
+      </w:r>
+      <w:r>
+        <w:t xml:space="preserve">methods in</w:t>
+      </w:r>
+      <w:r>
+        <w:t xml:space="preserve"> </w:t>
+      </w:r>
+      <w:hyperlink w:anchor="tbl-benchmarks">
+        <w:r>
+          <w:rPr>
+            <w:rStyle w:val="Hyperlink"/>
+          </w:rPr>
+          <w:t xml:space="preserve">Table 6</w:t>
+        </w:r>
+      </w:hyperlink>
+      <w:r>
+        <w:t xml:space="preserve">. The malaria/IHME enrichment that aided</w:t>
+      </w:r>
+      <w:r>
+        <w:t xml:space="preserve"> </w:t>
+      </w:r>
+      <w:r>
+        <w:t xml:space="preserve">within-country prediction</w:t>
+      </w:r>
+      <w:r>
+        <w:t xml:space="preserve"> </w:t>
+      </w:r>
+      <w:r>
+        <w:rPr>
+          <w:i/>
+          <w:iCs/>
+        </w:rPr>
+        <w:t xml:space="preserve">degraded</w:t>
+      </w:r>
+      <w:r>
+        <w:t xml:space="preserve"> </w:t>
+      </w:r>
+      <w:r>
+        <w:t xml:space="preserve">transport (mean child-iron Spearman 0.30</w:t>
+      </w:r>
+      <w:r>
+        <w:t xml:space="preserve"> </w:t>
+      </w:r>
+      <w:r>
+        <w:t xml:space="preserve">with universal features versus 0.20 enriched), because the malaria–iron and</w:t>
+      </w:r>
+      <w:r>
+        <w:t xml:space="preserve"> </w:t>
+      </w:r>
+      <w:r>
+        <w:t xml:space="preserve">modelled-burden relationships are country-specific rather than universal.</w:t>
+      </w:r>
+      <w:r>
+        <w:t xml:space="preserve"> </w:t>
+      </w:r>
+      <w:r>
+        <w:t xml:space="preserve">Cross-country prediction is therefore, at best, a ranking-only product, valid</w:t>
+      </w:r>
+      <w:r>
+        <w:t xml:space="preserve"> </w:t>
+      </w:r>
+      <w:r>
+        <w:t xml:space="preserve">within an epidemiologically similar neighbourhood with adequate covariate</w:t>
+      </w:r>
+      <w:r>
+        <w:t xml:space="preserve"> </w:t>
+      </w:r>
+      <w:r>
+        <w:t xml:space="preserve">coverage and requiring national-anchor calibration to recover the absolute</w:t>
+      </w:r>
+      <w:r>
+        <w:t xml:space="preserve"> </w:t>
+      </w:r>
+      <w:r>
+        <w:t xml:space="preserve">level.</w:t>
+      </w:r>
+    </w:p>
+    <w:tbl>
+      <w:tblPr>
+        <w:tblStyle w:val="Table"/>
+        <w:tblW w:type="pct" w:w="5000"/>
+        <w:tblLayout w:type="fixed"/>
+        <w:tblLook w:firstRow="0" w:lastRow="0" w:firstColumn="0" w:lastColumn="0" w:noHBand="0" w:noVBand="0" w:val="0000"/>
+      </w:tblPr>
+      <w:tblGrid>
+        <w:gridCol w:w="7920"/>
+      </w:tblGrid>
+      <w:tr>
+        <w:tc>
+          <w:tcPr/>
+          <w:bookmarkStart w:id="34" w:name="tbl-loco"/>
           <w:p>
             <w:pPr>
               <w:jc w:val="center"/>
@@ -34055,7 +36758,7 @@
               </w:tc>
             </w:tr>
           </w:tbl>
-          <w:bookmarkEnd w:id="33"/>
+          <w:bookmarkEnd w:id="34"/>
           <w:p/>
         </w:tc>
       </w:tr>
@@ -34073,7 +36776,7 @@
       <w:tr>
         <w:tc>
           <w:tcPr/>
-          <w:bookmarkStart w:id="37" w:name="fig-loco-scatter"/>
+          <w:bookmarkStart w:id="38" w:name="fig-loco-scatter"/>
           <w:p>
             <w:pPr>
               <w:pStyle w:val="Compact"/>
@@ -34084,18 +36787,18 @@
                 <wp:inline>
                   <wp:extent cx="5334000" cy="5053263"/>
                   <wp:effectExtent b="0" l="0" r="0" t="0"/>
-                  <wp:docPr descr="" title="" id="35" name="Picture"/>
+                  <wp:docPr descr="" title="" id="36" name="Picture"/>
                   <a:graphic>
                     <a:graphicData uri="http://schemas.openxmlformats.org/drawingml/2006/picture">
                       <pic:pic>
                         <pic:nvPicPr>
-                          <pic:cNvPr descr="../results/figures/loco_scatter.png" id="36" name="Picture"/>
+                          <pic:cNvPr descr="../results/figures/loco_scatter.png" id="37" name="Picture"/>
                           <pic:cNvPicPr>
                             <a:picLocks noChangeArrowheads="1" noChangeAspect="1"/>
                           </pic:cNvPicPr>
                         </pic:nvPicPr>
                         <pic:blipFill>
-                          <a:blip r:embed="rId34"/>
+                          <a:blip r:embed="rId35"/>
                           <a:stretch>
                             <a:fillRect/>
                           </a:stretch>
@@ -34135,7 +36838,7 @@
               <w:t xml:space="preserve">Figure 1: Observed vs predicted admin-2 deficiency prevalence under leave-one-country-out cross-validation, by outcome and held-out country. The reference line is y = x. Predicted prevalences are from the area-level SuperLearner trained on the remaining countries (three for iron, measured in four countries; four for vitamin A, measured in five).</w:t>
             </w:r>
           </w:p>
-          <w:bookmarkEnd w:id="37"/>
+          <w:bookmarkEnd w:id="38"/>
         </w:tc>
       </w:tr>
     </w:tbl>
@@ -34578,7 +37281,7 @@
       <w:tr>
         <w:tc>
           <w:tcPr/>
-          <w:bookmarkStart w:id="41" w:name="fig-transport-calibration"/>
+          <w:bookmarkStart w:id="42" w:name="fig-transport-calibration"/>
           <w:p>
             <w:pPr>
               <w:pStyle w:val="Compact"/>
@@ -34589,18 +37292,18 @@
                 <wp:inline>
                   <wp:extent cx="5334000" cy="6756400"/>
                   <wp:effectExtent b="0" l="0" r="0" t="0"/>
-                  <wp:docPr descr="" title="" id="39" name="Picture"/>
+                  <wp:docPr descr="" title="" id="40" name="Picture"/>
                   <a:graphic>
                     <a:graphicData uri="http://schemas.openxmlformats.org/drawingml/2006/picture">
                       <pic:pic>
                         <pic:nvPicPr>
-                          <pic:cNvPr descr="../results/figures/transport_calibration_loco_faceted.png" id="40" name="Picture"/>
+                          <pic:cNvPr descr="../results/figures/transport_calibration_loco_faceted.png" id="41" name="Picture"/>
                           <pic:cNvPicPr>
                             <a:picLocks noChangeArrowheads="1" noChangeAspect="1"/>
                           </pic:cNvPicPr>
                         </pic:nvPicPr>
                         <pic:blipFill>
-                          <a:blip r:embed="rId38"/>
+                          <a:blip r:embed="rId39"/>
                           <a:stretch>
                             <a:fillRect/>
                           </a:stretch>
@@ -34640,7 +37343,7 @@
               <w:t xml:space="preserve">Figure 2: Cross-country transport calibration. Predicted versus true national deficiency prevalence for the pooled individual-level SuperLearner under leave-one-country-out (LOCO) holdout — one panel per outcome, one point per held-out country (trained on the remaining countries), panels ordered worst to best calibration. The dashed line is perfect calibration (y = x); each panel header reports the fitted calibration slope (1.0 = perfectly calibrated; &lt;1 = predictions compressed toward the cross-country mean; &lt;0 = inverted ordering). Vertical segments mark each fold’s calibration gap. Vitamin-A national prevalence, close to the cross-country mean, is well recovered and folate (harmonised to a common serum &lt; 10 nmol/L cutoff) preserves the correct ordering; iron is pulled to the training mean and inverts, and vitamin B12 does not transport (near-chance discrimination, with unstable prediction under rare-outcome class-weighting). Folate and B12 are women-only and available in three countries; zinc is Malawi-only and cannot be assessed for transport. From results/tables/transportability_loco_results.csv.</w:t>
             </w:r>
           </w:p>
-          <w:bookmarkEnd w:id="41"/>
+          <w:bookmarkEnd w:id="42"/>
         </w:tc>
       </w:tr>
     </w:tbl>
@@ -34909,7 +37612,7 @@
       <w:tr>
         <w:tc>
           <w:tcPr/>
-          <w:bookmarkStart w:id="42" w:name="tbl-national-estimates"/>
+          <w:bookmarkStart w:id="43" w:name="tbl-national-estimates"/>
           <w:p>
             <w:pPr>
               <w:jc w:val="center"/>
@@ -36616,13 +39319,13 @@
               </w:tc>
             </w:tr>
           </w:tbl>
-          <w:bookmarkEnd w:id="42"/>
+          <w:bookmarkEnd w:id="43"/>
           <w:p/>
         </w:tc>
       </w:tr>
     </w:tbl>
-    <w:bookmarkEnd w:id="43"/>
-    <w:bookmarkStart w:id="45" w:name="Xd5671671c5e6012cba754b7c6de7f0569ea75d6"/>
+    <w:bookmarkEnd w:id="44"/>
+    <w:bookmarkStart w:id="46" w:name="Xd5671671c5e6012cba754b7c6de7f0569ea75d6"/>
     <w:p>
       <w:pPr>
         <w:pStyle w:val="Heading2"/>
@@ -36963,7 +39666,7 @@
       <w:tr>
         <w:tc>
           <w:tcPr/>
-          <w:bookmarkStart w:id="44" w:name="tbl-benchmarks"/>
+          <w:bookmarkStart w:id="45" w:name="tbl-benchmarks"/>
           <w:p>
             <w:pPr>
               <w:jc w:val="center"/>
@@ -42130,13 +44833,13 @@
               </w:tc>
             </w:tr>
           </w:tbl>
-          <w:bookmarkEnd w:id="44"/>
+          <w:bookmarkEnd w:id="45"/>
           <w:p/>
         </w:tc>
       </w:tr>
     </w:tbl>
-    <w:bookmarkEnd w:id="45"/>
-    <w:bookmarkStart w:id="50" w:name="Xc593a192c9af1d169522948dc5bcf261635606a"/>
+    <w:bookmarkEnd w:id="46"/>
+    <w:bookmarkStart w:id="51" w:name="Xc593a192c9af1d169522948dc5bcf261635606a"/>
     <w:p>
       <w:pPr>
         <w:pStyle w:val="Heading2"/>
@@ -42219,7 +44922,7 @@
       <w:tr>
         <w:tc>
           <w:tcPr/>
-          <w:bookmarkStart w:id="49" w:name="fig-all-methods-iron"/>
+          <w:bookmarkStart w:id="50" w:name="fig-all-methods-iron"/>
           <w:p>
             <w:pPr>
               <w:pStyle w:val="Compact"/>
@@ -42230,18 +44933,18 @@
                 <wp:inline>
                   <wp:extent cx="5334000" cy="2872153"/>
                   <wp:effectExtent b="0" l="0" r="0" t="0"/>
-                  <wp:docPr descr="" title="" id="47" name="Picture"/>
+                  <wp:docPr descr="" title="" id="48" name="Picture"/>
                   <a:graphic>
                     <a:graphicData uri="http://schemas.openxmlformats.org/drawingml/2006/picture">
                       <pic:pic>
                         <pic:nvPicPr>
-                          <pic:cNvPr descr="../results/figures/all_methods_child_iron.png" id="48" name="Picture"/>
+                          <pic:cNvPr descr="../results/figures/all_methods_child_iron.png" id="49" name="Picture"/>
                           <pic:cNvPicPr>
                             <a:picLocks noChangeArrowheads="1" noChangeAspect="1"/>
                           </pic:cNvPicPr>
                         </pic:nvPicPr>
                         <pic:blipFill>
-                          <a:blip r:embed="rId46"/>
+                          <a:blip r:embed="rId47"/>
                           <a:stretch>
                             <a:fillRect/>
                           </a:stretch>
@@ -42281,7 +44984,7 @@
               <w:t xml:space="preserve">Figure 3: Supplementary all-methods comparison for child iron deficiency. (a) Within-country 5-fold cross-validation Pearson r per method, with one dot per country and X-marks denoting the mean across the four countries. (b) Leave-one-country-out transportability Pearson r per method, with one dot per held-out country. Methods are ordered by mean LOCO r. The supplementary figure source data are in results/tables/all_methods_child_iron.csv.</w:t>
             </w:r>
           </w:p>
-          <w:bookmarkEnd w:id="49"/>
+          <w:bookmarkEnd w:id="50"/>
         </w:tc>
       </w:tr>
     </w:tbl>
@@ -42389,8 +45092,8 @@
         <w:t xml:space="preserve">help out-of-country.</w:t>
       </w:r>
     </w:p>
-    <w:bookmarkEnd w:id="50"/>
-    <w:bookmarkStart w:id="51" w:name="Xa2e5746a53e3a889f7b3d910dbcfb5a5009b7e7"/>
+    <w:bookmarkEnd w:id="51"/>
+    <w:bookmarkStart w:id="52" w:name="Xa2e5746a53e3a889f7b3d910dbcfb5a5009b7e7"/>
     <w:p>
       <w:pPr>
         <w:pStyle w:val="Heading2"/>
@@ -42631,8 +45334,8 @@
         <w:t xml:space="preserve">and require shrinkage before use.</w:t>
       </w:r>
     </w:p>
-    <w:bookmarkEnd w:id="51"/>
-    <w:bookmarkStart w:id="52" w:name="sec-fdr"/>
+    <w:bookmarkEnd w:id="52"/>
+    <w:bookmarkStart w:id="53" w:name="sec-fdr"/>
     <w:p>
       <w:pPr>
         <w:pStyle w:val="Heading2"/>
@@ -43061,8 +45764,8 @@
         <w:t xml:space="preserve">294-predictor set at admin-2, and the two findings have one explanation.</w:t>
       </w:r>
     </w:p>
-    <w:bookmarkEnd w:id="52"/>
-    <w:bookmarkStart w:id="53" w:name="sec-resolution"/>
+    <w:bookmarkEnd w:id="53"/>
+    <w:bookmarkStart w:id="54" w:name="sec-resolution"/>
     <w:p>
       <w:pPr>
         <w:pStyle w:val="Heading2"/>
@@ -43367,8 +46070,8 @@
         <w:t xml:space="preserve">of 14 admin-1 cells.</w:t>
       </w:r>
     </w:p>
-    <w:bookmarkEnd w:id="53"/>
-    <w:bookmarkStart w:id="54" w:name="sec-continuous"/>
+    <w:bookmarkEnd w:id="54"/>
+    <w:bookmarkStart w:id="55" w:name="sec-continuous"/>
     <w:p>
       <w:pPr>
         <w:pStyle w:val="Heading2"/>
@@ -43641,8 +46344,8 @@
         <w:t xml:space="preserve">as a general replacement.</w:t>
       </w:r>
     </w:p>
-    <w:bookmarkEnd w:id="54"/>
-    <w:bookmarkStart w:id="55" w:name="sec-zscore"/>
+    <w:bookmarkEnd w:id="55"/>
+    <w:bookmarkStart w:id="56" w:name="sec-zscore"/>
     <w:p>
       <w:pPr>
         <w:pStyle w:val="Heading2"/>
@@ -44006,8 +46709,8 @@
         <w:t xml:space="preserve">learner on assumption alone.</w:t>
       </w:r>
     </w:p>
-    <w:bookmarkEnd w:id="55"/>
-    <w:bookmarkStart w:id="57" w:name="Xe586b5600423ed014283786ef1ebd073c15fc43"/>
+    <w:bookmarkEnd w:id="56"/>
+    <w:bookmarkStart w:id="58" w:name="Xe586b5600423ed014283786ef1ebd073c15fc43"/>
     <w:p>
       <w:pPr>
         <w:pStyle w:val="Heading2"/>
@@ -44147,7 +46850,7 @@
       <w:tr>
         <w:tc>
           <w:tcPr/>
-          <w:bookmarkStart w:id="56" w:name="tbl-calibration"/>
+          <w:bookmarkStart w:id="57" w:name="tbl-calibration"/>
           <w:p>
             <w:pPr>
               <w:jc w:val="center"/>
@@ -46506,13 +49209,13 @@
               </w:tc>
             </w:tr>
           </w:tbl>
-          <w:bookmarkEnd w:id="56"/>
+          <w:bookmarkEnd w:id="57"/>
           <w:p/>
         </w:tc>
       </w:tr>
     </w:tbl>
-    <w:bookmarkEnd w:id="57"/>
-    <w:bookmarkStart w:id="61" w:name="X7519f55a912193215f6a0898c22ec7d335f2196"/>
+    <w:bookmarkEnd w:id="58"/>
+    <w:bookmarkStart w:id="62" w:name="X7519f55a912193215f6a0898c22ec7d335f2196"/>
     <w:p>
       <w:pPr>
         <w:pStyle w:val="Heading2"/>
@@ -46619,7 +49322,7 @@
       <w:tr>
         <w:tc>
           <w:tcPr/>
-          <w:bookmarkStart w:id="58" w:name="tbl-cv-honesty"/>
+          <w:bookmarkStart w:id="59" w:name="tbl-cv-honesty"/>
           <w:p>
             <w:pPr>
               <w:jc w:val="center"/>
@@ -48326,7 +51029,7 @@
               </w:tc>
             </w:tr>
           </w:tbl>
-          <w:bookmarkEnd w:id="58"/>
+          <w:bookmarkEnd w:id="59"/>
           <w:p/>
         </w:tc>
       </w:tr>
@@ -48445,7 +51148,7 @@
       <w:tr>
         <w:tc>
           <w:tcPr/>
-          <w:bookmarkStart w:id="59" w:name="tbl-corr-error"/>
+          <w:bookmarkStart w:id="60" w:name="tbl-corr-error"/>
           <w:p>
             <w:pPr>
               <w:jc w:val="center"/>
@@ -50804,7 +53507,7 @@
               </w:tc>
             </w:tr>
           </w:tbl>
-          <w:bookmarkEnd w:id="59"/>
+          <w:bookmarkEnd w:id="60"/>
           <w:p/>
         </w:tc>
       </w:tr>
@@ -50881,7 +53584,7 @@
       <w:tr>
         <w:tc>
           <w:tcPr/>
-          <w:bookmarkStart w:id="60" w:name="tbl-decision"/>
+          <w:bookmarkStart w:id="61" w:name="tbl-decision"/>
           <w:p>
             <w:pPr>
               <w:jc w:val="center"/>
@@ -52587,7 +55290,7 @@
               </w:tc>
             </w:tr>
           </w:tbl>
-          <w:bookmarkEnd w:id="60"/>
+          <w:bookmarkEnd w:id="61"/>
           <w:p/>
         </w:tc>
       </w:tr>
@@ -52703,9 +55406,9 @@
         <w:t xml:space="preserve">unsurveyed districts.</w:t>
       </w:r>
     </w:p>
-    <w:bookmarkEnd w:id="61"/>
     <w:bookmarkEnd w:id="62"/>
-    <w:bookmarkStart w:id="71" w:name="discussion"/>
+    <w:bookmarkEnd w:id="63"/>
+    <w:bookmarkStart w:id="72" w:name="discussion"/>
     <w:p>
       <w:pPr>
         <w:pStyle w:val="Heading1"/>
@@ -52714,7 +55417,7 @@
         <w:t xml:space="preserve">4. Discussion</w:t>
       </w:r>
     </w:p>
-    <w:bookmarkStart w:id="63" w:name="summary"/>
+    <w:bookmarkStart w:id="64" w:name="summary"/>
     <w:p>
       <w:pPr>
         <w:pStyle w:val="Heading2"/>
@@ -53247,8 +55950,8 @@
         <w:t xml:space="preserve">read with that magnitude in mind.</w:t>
       </w:r>
     </w:p>
-    <w:bookmarkEnd w:id="63"/>
-    <w:bookmarkStart w:id="64" w:name="X8384bfb506f112a014e118517ad335639a7a3de"/>
+    <w:bookmarkEnd w:id="64"/>
+    <w:bookmarkStart w:id="65" w:name="X8384bfb506f112a014e118517ad335639a7a3de"/>
     <w:p>
       <w:pPr>
         <w:pStyle w:val="Heading2"/>
@@ -53417,8 +56120,8 @@
         <w:t xml:space="preserve">ensemble is consistent with this tradition.</w:t>
       </w:r>
     </w:p>
-    <w:bookmarkEnd w:id="64"/>
-    <w:bookmarkStart w:id="65" w:name="X3056f5d8ad96ffc98d3bdd210856764d26c417f"/>
+    <w:bookmarkEnd w:id="65"/>
+    <w:bookmarkStart w:id="66" w:name="X3056f5d8ad96ffc98d3bdd210856764d26c417f"/>
     <w:p>
       <w:pPr>
         <w:pStyle w:val="Heading2"/>
@@ -53589,8 +56292,8 @@
         <w:t xml:space="preserve">cost was justified on none.</w:t>
       </w:r>
     </w:p>
-    <w:bookmarkEnd w:id="65"/>
-    <w:bookmarkStart w:id="66" w:name="implications-for-programming"/>
+    <w:bookmarkEnd w:id="66"/>
+    <w:bookmarkStart w:id="67" w:name="implications-for-programming"/>
     <w:p>
       <w:pPr>
         <w:pStyle w:val="Heading2"/>
@@ -53789,8 +56492,8 @@
         <w:t xml:space="preserve">(available in the project repository) is in progress.</w:t>
       </w:r>
     </w:p>
-    <w:bookmarkEnd w:id="66"/>
-    <w:bookmarkStart w:id="67" w:name="limitations"/>
+    <w:bookmarkEnd w:id="67"/>
+    <w:bookmarkStart w:id="68" w:name="limitations"/>
     <w:p>
       <w:pPr>
         <w:pStyle w:val="Heading2"/>
@@ -54095,8 +56798,8 @@
         <w:t xml:space="preserve">chance) and these outcomes should be treated as exploratory.</w:t>
       </w:r>
     </w:p>
-    <w:bookmarkEnd w:id="67"/>
-    <w:bookmarkStart w:id="68" w:name="external-validation-pathway"/>
+    <w:bookmarkEnd w:id="68"/>
+    <w:bookmarkStart w:id="69" w:name="external-validation-pathway"/>
     <w:p>
       <w:pPr>
         <w:pStyle w:val="Heading2"/>
@@ -54413,8 +57116,8 @@
         <w:t xml:space="preserve">LOCO, calibration, SHAP, and dashboard pipeline regenerates automatically.</w:t>
       </w:r>
     </w:p>
-    <w:bookmarkEnd w:id="68"/>
-    <w:bookmarkStart w:id="69" w:name="future-methodological-directions"/>
+    <w:bookmarkEnd w:id="69"/>
+    <w:bookmarkStart w:id="70" w:name="future-methodological-directions"/>
     <w:p>
       <w:pPr>
         <w:pStyle w:val="Heading2"/>
@@ -54891,8 +57594,8 @@
         <w:t xml:space="preserve">panel far beyond the four countries available here.</w:t>
       </w:r>
     </w:p>
-    <w:bookmarkEnd w:id="69"/>
-    <w:bookmarkStart w:id="70" w:name="conclusions"/>
+    <w:bookmarkEnd w:id="70"/>
+    <w:bookmarkStart w:id="71" w:name="conclusions"/>
     <w:p>
       <w:pPr>
         <w:pStyle w:val="Heading2"/>
@@ -55053,9 +57756,9 @@
         <w:t xml:space="preserve">resource-allocation decisions.</w:t>
       </w:r>
     </w:p>
-    <w:bookmarkEnd w:id="70"/>
     <w:bookmarkEnd w:id="71"/>
-    <w:bookmarkStart w:id="72" w:name="acknowledgements"/>
+    <w:bookmarkEnd w:id="72"/>
+    <w:bookmarkStart w:id="73" w:name="acknowledgements"/>
     <w:p>
       <w:pPr>
         <w:pStyle w:val="Heading1"/>
@@ -55084,8 +57787,8 @@
         <w:t xml:space="preserve">or manuscript preparation.</w:t>
       </w:r>
     </w:p>
-    <w:bookmarkEnd w:id="72"/>
-    <w:bookmarkStart w:id="73" w:name="author-contributions"/>
+    <w:bookmarkEnd w:id="73"/>
+    <w:bookmarkStart w:id="74" w:name="author-contributions"/>
     <w:p>
       <w:pPr>
         <w:pStyle w:val="Heading1"/>
@@ -55108,8 +57811,8 @@
         <w:t xml:space="preserve">manuscript. Co-authors to be added on revision.</w:t>
       </w:r>
     </w:p>
-    <w:bookmarkEnd w:id="73"/>
-    <w:bookmarkStart w:id="75" w:name="data-availability"/>
+    <w:bookmarkEnd w:id="74"/>
+    <w:bookmarkStart w:id="76" w:name="data-availability"/>
     <w:p>
       <w:pPr>
         <w:pStyle w:val="Heading1"/>
@@ -55131,7 +57834,7 @@
       <w:r>
         <w:t xml:space="preserve">(</w:t>
       </w:r>
-      <w:hyperlink r:id="rId74">
+      <w:hyperlink r:id="rId75">
         <w:r>
           <w:rPr>
             <w:rStyle w:val="Hyperlink"/>
@@ -55161,8 +57864,8 @@
         <w:t xml:space="preserve">.</w:t>
       </w:r>
     </w:p>
-    <w:bookmarkEnd w:id="75"/>
-    <w:bookmarkStart w:id="116" w:name="references"/>
+    <w:bookmarkEnd w:id="76"/>
+    <w:bookmarkStart w:id="117" w:name="references"/>
     <w:p>
       <w:pPr>
         <w:pStyle w:val="Heading1"/>
@@ -55171,8 +57874,8 @@
         <w:t xml:space="preserve">8. References</w:t>
       </w:r>
     </w:p>
-    <w:bookmarkStart w:id="115" w:name="refs"/>
-    <w:bookmarkStart w:id="77" w:name="ref-besag1991bayesian"/>
+    <w:bookmarkStart w:id="116" w:name="refs"/>
+    <w:bookmarkStart w:id="78" w:name="ref-besag1991bayesian"/>
     <w:p>
       <w:pPr>
         <w:pStyle w:val="Bibliography"/>
@@ -55205,7 +57908,7 @@
       <w:r>
         <w:t xml:space="preserve"> </w:t>
       </w:r>
-      <w:hyperlink r:id="rId76">
+      <w:hyperlink r:id="rId77">
         <w:r>
           <w:rPr>
             <w:rStyle w:val="Hyperlink"/>
@@ -55217,8 +57920,8 @@
         <w:t xml:space="preserve">.</w:t>
       </w:r>
     </w:p>
-    <w:bookmarkEnd w:id="77"/>
-    <w:bookmarkStart w:id="79" w:name="ref-fay1979estimates"/>
+    <w:bookmarkEnd w:id="78"/>
+    <w:bookmarkStart w:id="80" w:name="ref-fay1979estimates"/>
     <w:p>
       <w:pPr>
         <w:pStyle w:val="Bibliography"/>
@@ -55263,7 +57966,7 @@
       <w:r>
         <w:t xml:space="preserve"> </w:t>
       </w:r>
-      <w:hyperlink r:id="rId78">
+      <w:hyperlink r:id="rId79">
         <w:r>
           <w:rPr>
             <w:rStyle w:val="Hyperlink"/>
@@ -55275,8 +57978,8 @@
         <w:t xml:space="preserve">.</w:t>
       </w:r>
     </w:p>
-    <w:bookmarkEnd w:id="79"/>
-    <w:bookmarkStart w:id="81" w:name="ref-gorelick2017google"/>
+    <w:bookmarkEnd w:id="80"/>
+    <w:bookmarkStart w:id="82" w:name="ref-gorelick2017google"/>
     <w:p>
       <w:pPr>
         <w:pStyle w:val="Bibliography"/>
@@ -55318,7 +58021,7 @@
       <w:r>
         <w:t xml:space="preserve"> </w:t>
       </w:r>
-      <w:hyperlink r:id="rId80">
+      <w:hyperlink r:id="rId81">
         <w:r>
           <w:rPr>
             <w:rStyle w:val="Hyperlink"/>
@@ -55330,8 +58033,8 @@
         <w:t xml:space="preserve">.</w:t>
       </w:r>
     </w:p>
-    <w:bookmarkEnd w:id="81"/>
-    <w:bookmarkStart w:id="83" w:name="ref-vanderlaan2007super"/>
+    <w:bookmarkEnd w:id="82"/>
+    <w:bookmarkStart w:id="84" w:name="ref-vanderlaan2007super"/>
     <w:p>
       <w:pPr>
         <w:pStyle w:val="Bibliography"/>
@@ -55364,7 +58067,7 @@
       <w:r>
         <w:t xml:space="preserve"> </w:t>
       </w:r>
-      <w:hyperlink r:id="rId82">
+      <w:hyperlink r:id="rId83">
         <w:r>
           <w:rPr>
             <w:rStyle w:val="Hyperlink"/>
@@ -55376,8 +58079,8 @@
         <w:t xml:space="preserve">.</w:t>
       </w:r>
     </w:p>
-    <w:bookmarkEnd w:id="83"/>
-    <w:bookmarkStart w:id="85" w:name="ref-landau2021targets"/>
+    <w:bookmarkEnd w:id="84"/>
+    <w:bookmarkStart w:id="86" w:name="ref-landau2021targets"/>
     <w:p>
       <w:pPr>
         <w:pStyle w:val="Bibliography"/>
@@ -55428,7 +58131,7 @@
       <w:r>
         <w:t xml:space="preserve"> </w:t>
       </w:r>
-      <w:hyperlink r:id="rId84">
+      <w:hyperlink r:id="rId85">
         <w:r>
           <w:rPr>
             <w:rStyle w:val="Hyperlink"/>
@@ -55440,8 +58143,8 @@
         <w:t xml:space="preserve">.</w:t>
       </w:r>
     </w:p>
-    <w:bookmarkEnd w:id="85"/>
-    <w:bookmarkStart w:id="87" w:name="ref-local2021maps"/>
+    <w:bookmarkEnd w:id="86"/>
+    <w:bookmarkStart w:id="88" w:name="ref-local2021maps"/>
     <w:p>
       <w:pPr>
         <w:pStyle w:val="Bibliography"/>
@@ -55474,7 +58177,7 @@
       <w:r>
         <w:t xml:space="preserve"> </w:t>
       </w:r>
-      <w:hyperlink r:id="rId86">
+      <w:hyperlink r:id="rId87">
         <w:r>
           <w:rPr>
             <w:rStyle w:val="Hyperlink"/>
@@ -55486,8 +58189,8 @@
         <w:t xml:space="preserve">.</w:t>
       </w:r>
     </w:p>
-    <w:bookmarkEnd w:id="87"/>
-    <w:bookmarkStart w:id="89" w:name="ref-mercer2015small"/>
+    <w:bookmarkEnd w:id="88"/>
+    <w:bookmarkStart w:id="90" w:name="ref-mercer2015small"/>
     <w:p>
       <w:pPr>
         <w:pStyle w:val="Bibliography"/>
@@ -55520,7 +58223,7 @@
       <w:r>
         <w:t xml:space="preserve"> </w:t>
       </w:r>
-      <w:hyperlink r:id="rId88">
+      <w:hyperlink r:id="rId89">
         <w:r>
           <w:rPr>
             <w:rStyle w:val="Hyperlink"/>
@@ -55532,8 +58235,8 @@
         <w:t xml:space="preserve">.</w:t>
       </w:r>
     </w:p>
-    <w:bookmarkEnd w:id="89"/>
-    <w:bookmarkStart w:id="91" w:name="ref-knms2011"/>
+    <w:bookmarkEnd w:id="90"/>
+    <w:bookmarkStart w:id="92" w:name="ref-knms2011"/>
     <w:p>
       <w:pPr>
         <w:pStyle w:val="Bibliography"/>
@@ -55568,7 +58271,7 @@
       <w:r>
         <w:t xml:space="preserve"> </w:t>
       </w:r>
-      <w:hyperlink r:id="rId90">
+      <w:hyperlink r:id="rId91">
         <w:r>
           <w:rPr>
             <w:rStyle w:val="Hyperlink"/>
@@ -55580,8 +58283,8 @@
         <w:t xml:space="preserve">.</w:t>
       </w:r>
     </w:p>
-    <w:bookmarkEnd w:id="91"/>
-    <w:bookmarkStart w:id="93" w:name="ref-brinda2017adjustment"/>
+    <w:bookmarkEnd w:id="92"/>
+    <w:bookmarkStart w:id="94" w:name="ref-brinda2017adjustment"/>
     <w:p>
       <w:pPr>
         <w:pStyle w:val="Bibliography"/>
@@ -55614,7 +58317,7 @@
       <w:r>
         <w:t xml:space="preserve"> </w:t>
       </w:r>
-      <w:hyperlink r:id="rId92">
+      <w:hyperlink r:id="rId93">
         <w:r>
           <w:rPr>
             <w:rStyle w:val="Hyperlink"/>
@@ -55626,8 +58329,8 @@
         <w:t xml:space="preserve">.</w:t>
       </w:r>
     </w:p>
-    <w:bookmarkEnd w:id="93"/>
-    <w:bookmarkStart w:id="95" w:name="ref-niculescu2005predicting"/>
+    <w:bookmarkEnd w:id="94"/>
+    <w:bookmarkStart w:id="96" w:name="ref-niculescu2005predicting"/>
     <w:p>
       <w:pPr>
         <w:pStyle w:val="Bibliography"/>
@@ -55663,7 +58366,7 @@
       <w:r>
         <w:t xml:space="preserve"> </w:t>
       </w:r>
-      <w:hyperlink r:id="rId94">
+      <w:hyperlink r:id="rId95">
         <w:r>
           <w:rPr>
             <w:rStyle w:val="Hyperlink"/>
@@ -55675,8 +58378,8 @@
         <w:t xml:space="preserve">.</w:t>
       </w:r>
     </w:p>
-    <w:bookmarkEnd w:id="95"/>
-    <w:bookmarkStart w:id="97" w:name="ref-osgoodzimmerman2018mapping"/>
+    <w:bookmarkEnd w:id="96"/>
+    <w:bookmarkStart w:id="98" w:name="ref-osgoodzimmerman2018mapping"/>
     <w:p>
       <w:pPr>
         <w:pStyle w:val="Bibliography"/>
@@ -55721,7 +58424,7 @@
       <w:r>
         <w:t xml:space="preserve"> </w:t>
       </w:r>
-      <w:hyperlink r:id="rId96">
+      <w:hyperlink r:id="rId97">
         <w:r>
           <w:rPr>
             <w:rStyle w:val="Hyperlink"/>
@@ -55733,8 +58436,8 @@
         <w:t xml:space="preserve">.</w:t>
       </w:r>
     </w:p>
-    <w:bookmarkEnd w:id="97"/>
-    <w:bookmarkStart w:id="99" w:name="ref-riebler2016intuitive"/>
+    <w:bookmarkEnd w:id="98"/>
+    <w:bookmarkStart w:id="100" w:name="ref-riebler2016intuitive"/>
     <w:p>
       <w:pPr>
         <w:pStyle w:val="Bibliography"/>
@@ -55767,7 +58470,7 @@
       <w:r>
         <w:t xml:space="preserve"> </w:t>
       </w:r>
-      <w:hyperlink r:id="rId98">
+      <w:hyperlink r:id="rId99">
         <w:r>
           <w:rPr>
             <w:rStyle w:val="Hyperlink"/>
@@ -55779,8 +58482,8 @@
         <w:t xml:space="preserve">.</w:t>
       </w:r>
     </w:p>
-    <w:bookmarkEnd w:id="99"/>
-    <w:bookmarkStart w:id="101" w:name="ref-rue2009approximate"/>
+    <w:bookmarkEnd w:id="100"/>
+    <w:bookmarkStart w:id="102" w:name="ref-rue2009approximate"/>
     <w:p>
       <w:pPr>
         <w:pStyle w:val="Bibliography"/>
@@ -55849,7 +58552,7 @@
       <w:r>
         <w:t xml:space="preserve"> </w:t>
       </w:r>
-      <w:hyperlink r:id="rId100">
+      <w:hyperlink r:id="rId101">
         <w:r>
           <w:rPr>
             <w:rStyle w:val="Hyperlink"/>
@@ -55861,8 +58564,8 @@
         <w:t xml:space="preserve">.</w:t>
       </w:r>
     </w:p>
-    <w:bookmarkEnd w:id="101"/>
-    <w:bookmarkStart w:id="103" w:name="ref-vansmedenetal2019sample"/>
+    <w:bookmarkEnd w:id="102"/>
+    <w:bookmarkStart w:id="104" w:name="ref-vansmedenetal2019sample"/>
     <w:p>
       <w:pPr>
         <w:pStyle w:val="Bibliography"/>
@@ -55895,7 +58598,7 @@
       <w:r>
         <w:t xml:space="preserve"> </w:t>
       </w:r>
-      <w:hyperlink r:id="rId102">
+      <w:hyperlink r:id="rId103">
         <w:r>
           <w:rPr>
             <w:rStyle w:val="Hyperlink"/>
@@ -55907,8 +58610,8 @@
         <w:t xml:space="preserve">.</w:t>
       </w:r>
     </w:p>
-    <w:bookmarkEnd w:id="103"/>
-    <w:bookmarkStart w:id="105" w:name="ref-stevens2022micronutrient"/>
+    <w:bookmarkEnd w:id="104"/>
+    <w:bookmarkStart w:id="106" w:name="ref-stevens2022micronutrient"/>
     <w:p>
       <w:pPr>
         <w:pStyle w:val="Bibliography"/>
@@ -55941,7 +58644,7 @@
       <w:r>
         <w:t xml:space="preserve"> </w:t>
       </w:r>
-      <w:hyperlink r:id="rId104">
+      <w:hyperlink r:id="rId105">
         <w:r>
           <w:rPr>
             <w:rStyle w:val="Hyperlink"/>
@@ -55953,8 +58656,8 @@
         <w:t xml:space="preserve">.</w:t>
       </w:r>
     </w:p>
-    <w:bookmarkEnd w:id="105"/>
-    <w:bookmarkStart w:id="107" w:name="ref-brinda2017overview"/>
+    <w:bookmarkEnd w:id="106"/>
+    <w:bookmarkStart w:id="108" w:name="ref-brinda2017overview"/>
     <w:p>
       <w:pPr>
         <w:pStyle w:val="Bibliography"/>
@@ -55987,7 +58690,7 @@
       <w:r>
         <w:t xml:space="preserve"> </w:t>
       </w:r>
-      <w:hyperlink r:id="rId106">
+      <w:hyperlink r:id="rId107">
         <w:r>
           <w:rPr>
             <w:rStyle w:val="Hyperlink"/>
@@ -55999,8 +58702,8 @@
         <w:t xml:space="preserve">.</w:t>
       </w:r>
     </w:p>
-    <w:bookmarkEnd w:id="107"/>
-    <w:bookmarkStart w:id="109" w:name="ref-wakefield2019small"/>
+    <w:bookmarkEnd w:id="108"/>
+    <w:bookmarkStart w:id="110" w:name="ref-wakefield2019small"/>
     <w:p>
       <w:pPr>
         <w:pStyle w:val="Bibliography"/>
@@ -56033,7 +58736,7 @@
       <w:r>
         <w:t xml:space="preserve"> </w:t>
       </w:r>
-      <w:hyperlink r:id="rId108">
+      <w:hyperlink r:id="rId109">
         <w:r>
           <w:rPr>
             <w:rStyle w:val="Hyperlink"/>
@@ -56045,8 +58748,8 @@
         <w:t xml:space="preserve">.</w:t>
       </w:r>
     </w:p>
-    <w:bookmarkEnd w:id="109"/>
-    <w:bookmarkStart w:id="110" w:name="ref-who_vmnis_thresholds"/>
+    <w:bookmarkEnd w:id="110"/>
+    <w:bookmarkStart w:id="111" w:name="ref-who_vmnis_thresholds"/>
     <w:p>
       <w:pPr>
         <w:pStyle w:val="Bibliography"/>
@@ -56067,8 +58770,8 @@
         <w:t xml:space="preserve">WHO/NMH/NHD/MNM/11.3.</w:t>
       </w:r>
     </w:p>
-    <w:bookmarkEnd w:id="110"/>
-    <w:bookmarkStart w:id="112" w:name="ref-who2020anaemia"/>
+    <w:bookmarkEnd w:id="111"/>
+    <w:bookmarkStart w:id="113" w:name="ref-who2020anaemia"/>
     <w:p>
       <w:pPr>
         <w:pStyle w:val="Bibliography"/>
@@ -56085,7 +58788,7 @@
       <w:r>
         <w:t xml:space="preserve"> </w:t>
       </w:r>
-      <w:hyperlink r:id="rId111">
+      <w:hyperlink r:id="rId112">
         <w:r>
           <w:rPr>
             <w:rStyle w:val="Hyperlink"/>
@@ -56097,8 +58800,8 @@
         <w:t xml:space="preserve">.</w:t>
       </w:r>
     </w:p>
-    <w:bookmarkEnd w:id="112"/>
-    <w:bookmarkStart w:id="114" w:name="ref-who_vmnis"/>
+    <w:bookmarkEnd w:id="113"/>
+    <w:bookmarkStart w:id="115" w:name="ref-who_vmnis"/>
     <w:p>
       <w:pPr>
         <w:pStyle w:val="Bibliography"/>
@@ -56115,7 +58818,7 @@
       <w:r>
         <w:t xml:space="preserve"> </w:t>
       </w:r>
-      <w:hyperlink r:id="rId113">
+      <w:hyperlink r:id="rId114">
         <w:r>
           <w:rPr>
             <w:rStyle w:val="Hyperlink"/>
@@ -56127,9 +58830,9 @@
         <w:t xml:space="preserve">.</w:t>
       </w:r>
     </w:p>
-    <w:bookmarkEnd w:id="114"/>
     <w:bookmarkEnd w:id="115"/>
     <w:bookmarkEnd w:id="116"/>
+    <w:bookmarkEnd w:id="117"/>
     <w:sectPr/>
   </w:body>
 </w:document>

</xml_diff>